<commit_message>
Update final report files
</commit_message>
<xml_diff>
--- a/FINAL_REPORT.docx
+++ b/FINAL_REPORT.docx
@@ -745,59 +745,8 @@
                                 <w:sz w:val="32"/>
                                 <w:szCs w:val="32"/>
                               </w:rPr>
-                              <w:t xml:space="preserve">A Comparative Analysis of </w:t>
+                              <w:t>A Comparative Analysis of AdamW, AdaFactor, LAMB and Lion on IMDB Sentiment Classification using DistilBERT</w:t>
                             </w:r>
-                            <w:proofErr w:type="spellStart"/>
-                            <w:r>
-                              <w:rPr>
-                                <w:b/>
-                                <w:color w:val="95B3D7" w:themeColor="accent1" w:themeTint="99"/>
-                                <w:sz w:val="32"/>
-                                <w:szCs w:val="32"/>
-                              </w:rPr>
-                              <w:t>AdamW</w:t>
-                            </w:r>
-                            <w:proofErr w:type="spellEnd"/>
-                            <w:r>
-                              <w:rPr>
-                                <w:b/>
-                                <w:color w:val="95B3D7" w:themeColor="accent1" w:themeTint="99"/>
-                                <w:sz w:val="32"/>
-                                <w:szCs w:val="32"/>
-                              </w:rPr>
-                              <w:t xml:space="preserve">, </w:t>
-                            </w:r>
-                            <w:proofErr w:type="spellStart"/>
-                            <w:r>
-                              <w:rPr>
-                                <w:b/>
-                                <w:color w:val="95B3D7" w:themeColor="accent1" w:themeTint="99"/>
-                                <w:sz w:val="32"/>
-                                <w:szCs w:val="32"/>
-                              </w:rPr>
-                              <w:t>AdaFactor</w:t>
-                            </w:r>
-                            <w:proofErr w:type="spellEnd"/>
-                            <w:r>
-                              <w:rPr>
-                                <w:b/>
-                                <w:color w:val="95B3D7" w:themeColor="accent1" w:themeTint="99"/>
-                                <w:sz w:val="32"/>
-                                <w:szCs w:val="32"/>
-                              </w:rPr>
-                              <w:t xml:space="preserve">, LAMB and Lion on IMDB Sentiment Classification using </w:t>
-                            </w:r>
-                            <w:proofErr w:type="spellStart"/>
-                            <w:r>
-                              <w:rPr>
-                                <w:b/>
-                                <w:color w:val="95B3D7" w:themeColor="accent1" w:themeTint="99"/>
-                                <w:sz w:val="32"/>
-                                <w:szCs w:val="32"/>
-                              </w:rPr>
-                              <w:t>DistilBERT</w:t>
-                            </w:r>
-                            <w:proofErr w:type="spellEnd"/>
                           </w:p>
                         </w:txbxContent>
                       </wps:txbx>
@@ -891,13 +840,204 @@
       </w:pPr>
       <w:r>
         <w:rPr>
-          <w:rFonts w:asciiTheme="majorBidi" w:hAnsiTheme="majorBidi" w:cstheme="majorBidi"/>
           <w:noProof/>
         </w:rPr>
         <mc:AlternateContent>
           <mc:Choice Requires="wps">
             <w:drawing>
-              <wp:anchor distT="0" distB="0" distL="114300" distR="114300" simplePos="0" relativeHeight="251687424" behindDoc="0" locked="0" layoutInCell="1" allowOverlap="1" wp14:anchorId="067DB6D1" wp14:editId="61AC019F">
+              <wp:anchor distT="0" distB="0" distL="114300" distR="114300" simplePos="0" relativeHeight="251697664" behindDoc="0" locked="0" layoutInCell="1" allowOverlap="1" wp14:anchorId="11C2C04C" wp14:editId="1BEE1D40">
+                <wp:simplePos x="0" y="0"/>
+                <wp:positionH relativeFrom="column">
+                  <wp:posOffset>3236009</wp:posOffset>
+                </wp:positionH>
+                <wp:positionV relativeFrom="paragraph">
+                  <wp:posOffset>2111521</wp:posOffset>
+                </wp:positionV>
+                <wp:extent cx="2180492" cy="696350"/>
+                <wp:effectExtent l="0" t="0" r="0" b="8890"/>
+                <wp:wrapNone/>
+                <wp:docPr id="1648525658" name="Zone de texte 7"/>
+                <wp:cNvGraphicFramePr/>
+                <a:graphic xmlns:a="http://schemas.openxmlformats.org/drawingml/2006/main">
+                  <a:graphicData uri="http://schemas.microsoft.com/office/word/2010/wordprocessingShape">
+                    <wps:wsp>
+                      <wps:cNvSpPr txBox="1"/>
+                      <wps:spPr>
+                        <a:xfrm>
+                          <a:off x="0" y="0"/>
+                          <a:ext cx="2180492" cy="696350"/>
+                        </a:xfrm>
+                        <a:prstGeom prst="rect">
+                          <a:avLst/>
+                        </a:prstGeom>
+                        <a:solidFill>
+                          <a:schemeClr val="lt1"/>
+                        </a:solidFill>
+                        <a:ln w="6350">
+                          <a:noFill/>
+                        </a:ln>
+                      </wps:spPr>
+                      <wps:txbx>
+                        <w:txbxContent>
+                          <w:p>
+                            <w:pPr>
+                              <w:rPr>
+                                <w:b/>
+                                <w:bCs/>
+                                <w:lang w:val="fr-FR"/>
+                              </w:rPr>
+                            </w:pPr>
+                            <w:r>
+                              <w:rPr>
+                                <w:b/>
+                                <w:bCs/>
+                                <w:lang w:val="fr-FR"/>
+                              </w:rPr>
+                              <w:t xml:space="preserve">Supervisor : </w:t>
+                            </w:r>
+                          </w:p>
+                          <w:p>
+                            <w:pPr>
+                              <w:rPr>
+                                <w:lang w:val="fr-FR"/>
+                              </w:rPr>
+                            </w:pPr>
+                            <w:r>
+                              <w:rPr>
+                                <w:lang w:val="fr-FR"/>
+                              </w:rPr>
+                              <w:t>Faouzia Benabbou</w:t>
+                            </w:r>
+                          </w:p>
+                          <w:p>
+                            <w:pPr>
+                              <w:rPr>
+                                <w:lang w:val="fr-FR"/>
+                              </w:rPr>
+                            </w:pPr>
+                            <w:proofErr w:type="gramStart"/>
+                            <w:r>
+                              <w:rPr>
+                                <w:lang w:val="fr-FR"/>
+                              </w:rPr>
+                              <w:t>fouzia</w:t>
+                            </w:r>
+                            <w:proofErr w:type="gramEnd"/>
+                          </w:p>
+                          <w:p>
+                            <w:pPr>
+                              <w:pStyle w:val="Paragraphedeliste"/>
+                              <w:numPr>
+                                <w:ilvl w:val="0"/>
+                                <w:numId w:val="13"/>
+                              </w:numPr>
+                              <w:rPr>
+                                <w:lang w:val="fr-FR"/>
+                              </w:rPr>
+                            </w:pPr>
+                          </w:p>
+                        </w:txbxContent>
+                      </wps:txbx>
+                      <wps:bodyPr rot="0" spcFirstLastPara="0" vertOverflow="overflow" horzOverflow="overflow" vert="horz" wrap="square" lIns="91440" tIns="45720" rIns="91440" bIns="45720" numCol="1" spcCol="0" rtlCol="0" fromWordArt="0" anchor="t" anchorCtr="0" forceAA="0" compatLnSpc="1">
+                        <a:prstTxWarp prst="textNoShape">
+                          <a:avLst/>
+                        </a:prstTxWarp>
+                        <a:noAutofit/>
+                      </wps:bodyPr>
+                    </wps:wsp>
+                  </a:graphicData>
+                </a:graphic>
+                <wp14:sizeRelH relativeFrom="margin">
+                  <wp14:pctWidth>0</wp14:pctWidth>
+                </wp14:sizeRelH>
+                <wp14:sizeRelV relativeFrom="margin">
+                  <wp14:pctHeight>0</wp14:pctHeight>
+                </wp14:sizeRelV>
+              </wp:anchor>
+            </w:drawing>
+          </mc:Choice>
+          <mc:Fallback>
+            <w:pict>
+              <v:shapetype w14:anchorId="11C2C04C" id="_x0000_t202" coordsize="21600,21600" o:spt="202" path="m,l,21600r21600,l21600,xe">
+                <v:stroke joinstyle="miter"/>
+                <v:path gradientshapeok="t" o:connecttype="rect"/>
+              </v:shapetype>
+              <v:shape id="Zone de texte 7" o:spid="_x0000_s1029" type="#_x0000_t202" style="position:absolute;left:0;text-align:left;margin-left:254.8pt;margin-top:166.25pt;width:171.7pt;height:54.85pt;z-index:251697664;visibility:visible;mso-wrap-style:square;mso-width-percent:0;mso-height-percent:0;mso-wrap-distance-left:9pt;mso-wrap-distance-top:0;mso-wrap-distance-right:9pt;mso-wrap-distance-bottom:0;mso-position-horizontal:absolute;mso-position-horizontal-relative:text;mso-position-vertical:absolute;mso-position-vertical-relative:text;mso-width-percent:0;mso-height-percent:0;mso-width-relative:margin;mso-height-relative:margin;v-text-anchor:top" o:gfxdata="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" fillcolor="white [3201]" stroked="f" strokeweight=".5pt">
+                <v:textbox>
+                  <w:txbxContent>
+                    <w:p>
+                      <w:pPr>
+                        <w:rPr>
+                          <w:b/>
+                          <w:bCs/>
+                          <w:lang w:val="fr-FR"/>
+                        </w:rPr>
+                      </w:pPr>
+                      <w:r>
+                        <w:rPr>
+                          <w:b/>
+                          <w:bCs/>
+                          <w:lang w:val="fr-FR"/>
+                        </w:rPr>
+                        <w:t xml:space="preserve">Supervisor : </w:t>
+                      </w:r>
+                    </w:p>
+                    <w:p>
+                      <w:pPr>
+                        <w:rPr>
+                          <w:lang w:val="fr-FR"/>
+                        </w:rPr>
+                      </w:pPr>
+                      <w:r>
+                        <w:rPr>
+                          <w:lang w:val="fr-FR"/>
+                        </w:rPr>
+                        <w:t>Faouzia Benabbou</w:t>
+                      </w:r>
+                    </w:p>
+                    <w:p>
+                      <w:pPr>
+                        <w:rPr>
+                          <w:lang w:val="fr-FR"/>
+                        </w:rPr>
+                      </w:pPr>
+                      <w:proofErr w:type="gramStart"/>
+                      <w:r>
+                        <w:rPr>
+                          <w:lang w:val="fr-FR"/>
+                        </w:rPr>
+                        <w:t>fouzia</w:t>
+                      </w:r>
+                      <w:proofErr w:type="gramEnd"/>
+                    </w:p>
+                    <w:p>
+                      <w:pPr>
+                        <w:pStyle w:val="Paragraphedeliste"/>
+                        <w:numPr>
+                          <w:ilvl w:val="0"/>
+                          <w:numId w:val="13"/>
+                        </w:numPr>
+                        <w:rPr>
+                          <w:lang w:val="fr-FR"/>
+                        </w:rPr>
+                      </w:pPr>
+                    </w:p>
+                  </w:txbxContent>
+                </v:textbox>
+              </v:shape>
+            </w:pict>
+          </mc:Fallback>
+        </mc:AlternateContent>
+      </w:r>
+      <w:r>
+        <w:rPr>
+          <w:rFonts w:asciiTheme="majorBidi" w:hAnsiTheme="majorBidi" w:cstheme="majorBidi"/>
+          <w:noProof/>
+        </w:rPr>
+        <mc:AlternateContent>
+          <mc:Choice Requires="wps">
+            <w:drawing>
+              <wp:anchor distT="0" distB="0" distL="114300" distR="114300" simplePos="0" relativeHeight="251687424" behindDoc="0" locked="0" layoutInCell="1" allowOverlap="1" wp14:anchorId="067DB6D1" wp14:editId="47FDFBB1">
                 <wp:simplePos x="0" y="0"/>
                 <wp:positionH relativeFrom="margin">
                   <wp:posOffset>1633855</wp:posOffset>
@@ -971,7 +1111,7 @@
           </mc:Choice>
           <mc:Fallback>
             <w:pict>
-              <v:roundrect w14:anchorId="067DB6D1" id="Rectangle: Rounded Corners 1" o:spid="_x0000_s1029" style="position:absolute;left:0;text-align:left;margin-left:128.65pt;margin-top:299pt;width:198pt;height:29.8pt;z-index:251687424;visibility:visible;mso-wrap-style:square;mso-wrap-distance-left:9pt;mso-wrap-distance-top:0;mso-wrap-distance-right:9pt;mso-wrap-distance-bottom:0;mso-position-horizontal:absolute;mso-position-horizontal-relative:margin;mso-position-vertical:absolute;mso-position-vertical-relative:text;v-text-anchor:bottom" arcsize="10923f" o:gfxdata="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" fillcolor="white [3201]" strokecolor="#4f81bd [3204]" strokeweight="2pt">
+              <v:roundrect w14:anchorId="067DB6D1" id="Rectangle: Rounded Corners 1" o:spid="_x0000_s1030" style="position:absolute;left:0;text-align:left;margin-left:128.65pt;margin-top:299pt;width:198pt;height:29.8pt;z-index:251687424;visibility:visible;mso-wrap-style:square;mso-wrap-distance-left:9pt;mso-wrap-distance-top:0;mso-wrap-distance-right:9pt;mso-wrap-distance-bottom:0;mso-position-horizontal:absolute;mso-position-horizontal-relative:margin;mso-position-vertical:absolute;mso-position-vertical-relative:text;v-text-anchor:bottom" arcsize="10923f" o:gfxdata="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" fillcolor="white [3201]" strokecolor="#4f81bd [3204]" strokeweight="2pt">
                 <v:textbox>
                   <w:txbxContent>
                     <w:p>
@@ -1010,7 +1150,7 @@
         <mc:AlternateContent>
           <mc:Choice Requires="wps">
             <w:drawing>
-              <wp:anchor distT="0" distB="0" distL="114300" distR="114300" simplePos="0" relativeHeight="251659776" behindDoc="0" locked="0" layoutInCell="1" allowOverlap="1" wp14:anchorId="5E614017" wp14:editId="149D6B6C">
+              <wp:anchor distT="0" distB="0" distL="114300" distR="114300" simplePos="0" relativeHeight="251659776" behindDoc="0" locked="0" layoutInCell="1" allowOverlap="1" wp14:anchorId="5E614017" wp14:editId="21CC09DA">
                 <wp:simplePos x="0" y="0"/>
                 <wp:positionH relativeFrom="margin">
                   <wp:posOffset>8255</wp:posOffset>
@@ -1063,7 +1203,6 @@
                                 <w:lang w:val="fr-FR"/>
                               </w:rPr>
                             </w:pPr>
-                            <w:proofErr w:type="spellStart"/>
                             <w:r>
                               <w:rPr>
                                 <w:b/>
@@ -1072,31 +1211,8 @@
                                 <w:szCs w:val="24"/>
                                 <w:lang w:val="fr-FR"/>
                               </w:rPr>
-                              <w:t>Prepared</w:t>
+                              <w:t>Prepared by:</w:t>
                             </w:r>
-                            <w:proofErr w:type="spellEnd"/>
-                            <w:r>
-                              <w:rPr>
-                                <w:b/>
-                                <w:bCs/>
-                                <w:color w:val="000000" w:themeColor="text1"/>
-                                <w:szCs w:val="24"/>
-                                <w:lang w:val="fr-FR"/>
-                              </w:rPr>
-                              <w:t xml:space="preserve"> </w:t>
-                            </w:r>
-                            <w:proofErr w:type="gramStart"/>
-                            <w:r>
-                              <w:rPr>
-                                <w:b/>
-                                <w:bCs/>
-                                <w:color w:val="000000" w:themeColor="text1"/>
-                                <w:szCs w:val="24"/>
-                                <w:lang w:val="fr-FR"/>
-                              </w:rPr>
-                              <w:t>by:</w:t>
-                            </w:r>
-                            <w:proofErr w:type="gramEnd"/>
                             <w:r>
                               <w:rPr>
                                 <w:b/>
@@ -1309,7 +1425,7 @@
           </mc:Choice>
           <mc:Fallback>
             <w:pict>
-              <v:roundrect w14:anchorId="5E614017" id="_x0000_s1030" style="position:absolute;left:0;text-align:left;margin-left:.65pt;margin-top:160.1pt;width:439pt;height:108pt;z-index:251659776;visibility:visible;mso-wrap-style:square;mso-width-percent:0;mso-height-percent:0;mso-wrap-distance-left:9pt;mso-wrap-distance-top:0;mso-wrap-distance-right:9pt;mso-wrap-distance-bottom:0;mso-position-horizontal:absolute;mso-position-horizontal-relative:margin;mso-position-vertical:absolute;mso-position-vertical-relative:text;mso-width-percent:0;mso-height-percent:0;mso-width-relative:margin;mso-height-relative:margin;v-text-anchor:middle" arcsize="10923f" o:gfxdata="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" fillcolor="white [3201]" strokecolor="#4f81bd [3204]" strokeweight="2pt">
+              <v:roundrect w14:anchorId="5E614017" id="_x0000_s1031" style="position:absolute;left:0;text-align:left;margin-left:.65pt;margin-top:160.1pt;width:439pt;height:108pt;z-index:251659776;visibility:visible;mso-wrap-style:square;mso-width-percent:0;mso-height-percent:0;mso-wrap-distance-left:9pt;mso-wrap-distance-top:0;mso-wrap-distance-right:9pt;mso-wrap-distance-bottom:0;mso-position-horizontal:absolute;mso-position-horizontal-relative:margin;mso-position-vertical:absolute;mso-position-vertical-relative:text;mso-width-percent:0;mso-height-percent:0;mso-width-relative:margin;mso-height-relative:margin;v-text-anchor:middle" arcsize="10923f" o:gfxdata="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" fillcolor="white [3201]" strokecolor="#4f81bd [3204]" strokeweight="2pt">
                 <v:textbox>
                   <w:txbxContent>
                     <w:p>
@@ -1533,73 +1649,6 @@
           </mc:Fallback>
         </mc:AlternateContent>
       </w:r>
-      <w:r>
-        <w:rPr>
-          <w:rFonts w:asciiTheme="majorBidi" w:hAnsiTheme="majorBidi" w:cstheme="majorBidi"/>
-          <w:noProof/>
-          <w:color w:val="000000" w:themeColor="text1"/>
-          <w:szCs w:val="24"/>
-          <w:lang w:val="fr-FR"/>
-        </w:rPr>
-        <w:drawing>
-          <wp:anchor distT="0" distB="0" distL="114300" distR="114300" simplePos="0" relativeHeight="251704832" behindDoc="0" locked="0" layoutInCell="1" allowOverlap="1" wp14:anchorId="13F5C66E" wp14:editId="176303BA">
-            <wp:simplePos x="0" y="0"/>
-            <wp:positionH relativeFrom="column">
-              <wp:posOffset>3291205</wp:posOffset>
-            </wp:positionH>
-            <wp:positionV relativeFrom="paragraph">
-              <wp:posOffset>2204720</wp:posOffset>
-            </wp:positionV>
-            <wp:extent cx="1809750" cy="711200"/>
-            <wp:effectExtent l="0" t="0" r="0" b="0"/>
-            <wp:wrapSquare wrapText="bothSides"/>
-            <wp:docPr id="540000498" name="Image 2"/>
-            <wp:cNvGraphicFramePr>
-              <a:graphicFrameLocks xmlns:a="http://schemas.openxmlformats.org/drawingml/2006/main" noChangeAspect="1"/>
-            </wp:cNvGraphicFramePr>
-            <a:graphic xmlns:a="http://schemas.openxmlformats.org/drawingml/2006/main">
-              <a:graphicData uri="http://schemas.openxmlformats.org/drawingml/2006/picture">
-                <pic:pic xmlns:pic="http://schemas.openxmlformats.org/drawingml/2006/picture">
-                  <pic:nvPicPr>
-                    <pic:cNvPr id="0" name="Picture 1"/>
-                    <pic:cNvPicPr>
-                      <a:picLocks noChangeAspect="1" noChangeArrowheads="1"/>
-                    </pic:cNvPicPr>
-                  </pic:nvPicPr>
-                  <pic:blipFill>
-                    <a:blip r:embed="rId11">
-                      <a:extLst>
-                        <a:ext uri="{28A0092B-C50C-407E-A947-70E740481C1C}">
-                          <a14:useLocalDpi xmlns:a14="http://schemas.microsoft.com/office/drawing/2010/main" val="0"/>
-                        </a:ext>
-                      </a:extLst>
-                    </a:blip>
-                    <a:srcRect/>
-                    <a:stretch>
-                      <a:fillRect/>
-                    </a:stretch>
-                  </pic:blipFill>
-                  <pic:spPr bwMode="auto">
-                    <a:xfrm>
-                      <a:off x="0" y="0"/>
-                      <a:ext cx="1809750" cy="711200"/>
-                    </a:xfrm>
-                    <a:prstGeom prst="rect">
-                      <a:avLst/>
-                    </a:prstGeom>
-                    <a:ln>
-                      <a:noFill/>
-                    </a:ln>
-                    <a:effectLst>
-                      <a:softEdge rad="112500"/>
-                    </a:effectLst>
-                  </pic:spPr>
-                </pic:pic>
-              </a:graphicData>
-            </a:graphic>
-          </wp:anchor>
-        </w:drawing>
-      </w:r>
     </w:p>
     <w:p>
       <w:pPr>
@@ -1631,55 +1680,7 @@
         <w:jc w:val="both"/>
       </w:pPr>
       <w:r>
-        <w:t xml:space="preserve">This academic research project presents a thorough comparative study of five gradient descent optimization algorithms for fine-tuning a lightweight Transformer model on a Natural Language Processing (NLP) task. We compare a classical non-adaptive baseline (SGD with Momentum) against four modern adaptive gradient optimizers: </w:t>
-      </w:r>
-      <w:proofErr w:type="spellStart"/>
-      <w:r>
-        <w:t>AdamW</w:t>
-      </w:r>
-      <w:proofErr w:type="spellEnd"/>
-      <w:r>
-        <w:t xml:space="preserve">, </w:t>
-      </w:r>
-      <w:proofErr w:type="spellStart"/>
-      <w:r>
-        <w:t>AdaFactor</w:t>
-      </w:r>
-      <w:proofErr w:type="spellEnd"/>
-      <w:r>
-        <w:t xml:space="preserve">, LAMB, and Lion. The evaluation is carried out on the </w:t>
-      </w:r>
-      <w:proofErr w:type="spellStart"/>
-      <w:r>
-        <w:t>DistilBERT</w:t>
-      </w:r>
-      <w:proofErr w:type="spellEnd"/>
-      <w:r>
-        <w:t xml:space="preserve"> architecture for binary sentiment classification using the IMDB movie reviews dataset. The optimizers are analyzed along several critical performance axes: convergence speed, training stability, learning rate sensitivity, batch size stability, GPU peak memory consumption, and layer-wise gradient norm dynamics. Empirical results demonstrate that </w:t>
-      </w:r>
-      <w:proofErr w:type="spellStart"/>
-      <w:r>
-        <w:t>AdaFactor</w:t>
-      </w:r>
-      <w:proofErr w:type="spellEnd"/>
-      <w:r>
-        <w:t xml:space="preserve"> achieves the best overall trade-off, securing the highest test F1-score (89.72%) while reducing peak GPU memory usage by approximately 30% compared to standard </w:t>
-      </w:r>
-      <w:proofErr w:type="spellStart"/>
-      <w:r>
-        <w:t>AdamW</w:t>
-      </w:r>
-      <w:proofErr w:type="spellEnd"/>
-      <w:r>
-        <w:t xml:space="preserve">. Conversely, the non-adaptive SGD baseline fails to converge efficiently within the allotted epochs, highlighting the necessity of parameter-wise adaptive learning rates for optimizing Transformer models. A transferability extension template using the </w:t>
-      </w:r>
-      <w:proofErr w:type="spellStart"/>
-      <w:r>
-        <w:t>MiniLM</w:t>
-      </w:r>
-      <w:proofErr w:type="spellEnd"/>
-      <w:r>
-        <w:t xml:space="preserve"> architecture is also provided to support further research.</w:t>
+        <w:t>This academic research project presents a thorough comparative study of five gradient descent optimization algorithms for fine-tuning a lightweight Transformer model on a Natural Language Processing (NLP) task. We compare a classical non-adaptive baseline (SGD with Momentum) against four modern adaptive gradient optimizers: AdamW, AdaFactor, LAMB, and Lion. The evaluation is carried out on the DistilBERT architecture for binary sentiment classification using the IMDB movie reviews dataset. The optimizers are analyzed along several critical performance axes: convergence speed, training stability, learning rate sensitivity, batch size stability, GPU peak memory consumption, and layer-wise gradient norm dynamics. Empirical results demonstrate that AdaFactor achieves the best overall trade-off, securing the highest test F1-score (89.72%) while reducing peak GPU memory usage by approximately 30% compared to standard AdamW. Conversely, the non-adaptive SGD baseline fails to converge efficiently within the allotted epochs, highlighting the necessity of parameter-wise adaptive learning rates for optimizing Transformer models. A transferability extension template using the MiniLM architecture is also provided to support further research.</w:t>
       </w:r>
     </w:p>
     <w:p>
@@ -1690,37 +1691,19 @@
         <w:t xml:space="preserve">Keywords: </w:t>
       </w:r>
       <w:r>
-        <w:t xml:space="preserve">Adaptive optimization, Transformers, Deep Learning, NLP, </w:t>
-      </w:r>
-      <w:proofErr w:type="spellStart"/>
-      <w:r>
-        <w:t>DistilBER</w:t>
+        <w:t>Adaptive optimization, Transformers, Deep Learning, NLP, DistilBER</w:t>
       </w:r>
       <w:r>
         <w:t>T</w:t>
       </w:r>
-      <w:proofErr w:type="spellEnd"/>
       <w:r>
         <w:t>,</w:t>
       </w:r>
       <w:r>
         <w:t xml:space="preserve"> </w:t>
       </w:r>
-      <w:proofErr w:type="spellStart"/>
-      <w:r>
-        <w:t>AdaFactor</w:t>
-      </w:r>
-      <w:proofErr w:type="spellEnd"/>
-      <w:r>
-        <w:t xml:space="preserve">, </w:t>
-      </w:r>
-      <w:proofErr w:type="spellStart"/>
-      <w:r>
-        <w:t>AdamW</w:t>
-      </w:r>
-      <w:proofErr w:type="spellEnd"/>
-      <w:r>
-        <w:t>, Lion, Sentiment analysis.</w:t>
+      <w:r>
+        <w:t>AdaFactor, AdamW, Lion, Sentiment analysis.</w:t>
       </w:r>
     </w:p>
     <w:p>
@@ -5007,15 +4990,7 @@
         <w:tabs>
           <w:tab w:val="right" w:leader="dot" w:pos="9062"/>
         </w:tabs>
-        <w:ind w:left="-709" w:hanging="425"/>
-        <w:rPr>
-          <w:rFonts w:asciiTheme="minorHAnsi" w:hAnsiTheme="minorHAnsi"/>
-          <w:noProof/>
-          <w:kern w:val="2"/>
-          <w:sz w:val="22"/>
-          <w:lang w:val="fr-FR" w:eastAsia="fr-FR"/>
-          <w14:ligatures w14:val="standardContextual"/>
-        </w:rPr>
+        <w:ind w:left="-709" w:firstLine="142"/>
       </w:pPr>
       <w:r>
         <w:fldChar w:fldCharType="begin"/>
@@ -5101,7 +5076,7 @@
           <w:tab w:val="right" w:leader="dot" w:pos="9062"/>
         </w:tabs>
         <w:spacing w:line="480" w:lineRule="auto"/>
-        <w:ind w:left="-709" w:hanging="425"/>
+        <w:ind w:left="-709" w:firstLine="142"/>
         <w:rPr>
           <w:rFonts w:asciiTheme="minorHAnsi" w:hAnsiTheme="minorHAnsi"/>
           <w:noProof/>
@@ -5120,7 +5095,17 @@
             <w:noProof/>
             <w:sz w:val="22"/>
           </w:rPr>
-          <w:t>Figure 2:Global NLP architecture flowchart outlining preprocessing, tokenization, and DistilBERT execution.</w:t>
+          <w:t xml:space="preserve">Figure 2:Global NLP architecture flowchart outlining preprocessing, tokenization, and DistilBERT </w:t>
+        </w:r>
+        <w:r>
+          <w:rPr>
+            <w:rStyle w:val="Lienhypertexte"/>
+            <w:i/>
+            <w:iCs/>
+            <w:noProof/>
+            <w:sz w:val="22"/>
+          </w:rPr>
+          <w:t xml:space="preserve">   </w:t>
         </w:r>
         <w:r>
           <w:rPr>
@@ -5186,7 +5171,7 @@
           <w:tab w:val="right" w:leader="dot" w:pos="9062"/>
         </w:tabs>
         <w:spacing w:line="480" w:lineRule="auto"/>
-        <w:ind w:left="-709" w:hanging="425"/>
+        <w:ind w:left="-567"/>
         <w:rPr>
           <w:rFonts w:asciiTheme="minorHAnsi" w:hAnsiTheme="minorHAnsi"/>
           <w:noProof/>
@@ -5203,7 +5188,7 @@
             <w:noProof/>
             <w:sz w:val="22"/>
           </w:rPr>
-          <w:t>Figure 3:Experimental pipeline outlining dataset splitting, multi-optimizer benchmarking, and metric extraction.</w:t>
+          <w:t>Figure 3:Experimental pipeline outlining dataset splitting, multi-optimizer benchmarking.</w:t>
         </w:r>
         <w:r>
           <w:rPr>
@@ -5269,7 +5254,7 @@
           <w:tab w:val="right" w:leader="dot" w:pos="9062"/>
         </w:tabs>
         <w:spacing w:line="480" w:lineRule="auto"/>
-        <w:ind w:left="-709" w:hanging="425"/>
+        <w:ind w:left="-709" w:firstLine="142"/>
         <w:rPr>
           <w:rFonts w:asciiTheme="minorHAnsi" w:hAnsiTheme="minorHAnsi"/>
           <w:noProof/>
@@ -5352,7 +5337,7 @@
           <w:tab w:val="right" w:leader="dot" w:pos="9062"/>
         </w:tabs>
         <w:spacing w:line="480" w:lineRule="auto"/>
-        <w:ind w:left="-709" w:hanging="425"/>
+        <w:ind w:left="-709" w:firstLine="142"/>
         <w:rPr>
           <w:rFonts w:asciiTheme="minorHAnsi" w:hAnsiTheme="minorHAnsi"/>
           <w:noProof/>
@@ -5435,7 +5420,7 @@
           <w:tab w:val="right" w:leader="dot" w:pos="9062"/>
         </w:tabs>
         <w:spacing w:line="480" w:lineRule="auto"/>
-        <w:ind w:left="-709" w:hanging="425"/>
+        <w:ind w:left="-709" w:firstLine="142"/>
         <w:rPr>
           <w:rFonts w:asciiTheme="minorHAnsi" w:hAnsiTheme="minorHAnsi"/>
           <w:noProof/>
@@ -5518,7 +5503,7 @@
           <w:tab w:val="right" w:leader="dot" w:pos="9062"/>
         </w:tabs>
         <w:spacing w:line="480" w:lineRule="auto"/>
-        <w:ind w:left="-709" w:hanging="425"/>
+        <w:ind w:left="-709" w:firstLine="142"/>
         <w:rPr>
           <w:rFonts w:asciiTheme="minorHAnsi" w:hAnsiTheme="minorHAnsi"/>
           <w:noProof/>
@@ -5601,7 +5586,7 @@
           <w:tab w:val="right" w:leader="dot" w:pos="9062"/>
         </w:tabs>
         <w:spacing w:line="480" w:lineRule="auto"/>
-        <w:ind w:left="-709" w:hanging="425"/>
+        <w:ind w:left="-709" w:firstLine="142"/>
         <w:rPr>
           <w:rFonts w:asciiTheme="minorHAnsi" w:hAnsiTheme="minorHAnsi"/>
           <w:noProof/>
@@ -5684,7 +5669,7 @@
           <w:tab w:val="right" w:leader="dot" w:pos="9062"/>
         </w:tabs>
         <w:spacing w:line="480" w:lineRule="auto"/>
-        <w:ind w:left="-709" w:hanging="425"/>
+        <w:ind w:left="-709" w:firstLine="142"/>
         <w:rPr>
           <w:rFonts w:asciiTheme="minorHAnsi" w:hAnsiTheme="minorHAnsi"/>
           <w:noProof/>
@@ -5767,7 +5752,7 @@
           <w:tab w:val="right" w:leader="dot" w:pos="9062"/>
         </w:tabs>
         <w:spacing w:line="480" w:lineRule="auto"/>
-        <w:ind w:left="-709" w:hanging="425"/>
+        <w:ind w:left="-709" w:firstLine="142"/>
         <w:rPr>
           <w:rFonts w:asciiTheme="minorHAnsi" w:hAnsiTheme="minorHAnsi"/>
           <w:noProof/>
@@ -5850,7 +5835,7 @@
           <w:tab w:val="right" w:leader="dot" w:pos="9062"/>
         </w:tabs>
         <w:spacing w:line="480" w:lineRule="auto"/>
-        <w:ind w:left="-709" w:hanging="425"/>
+        <w:ind w:left="-709" w:firstLine="142"/>
         <w:rPr>
           <w:rFonts w:asciiTheme="minorHAnsi" w:hAnsiTheme="minorHAnsi"/>
           <w:noProof/>
@@ -5933,7 +5918,7 @@
           <w:tab w:val="right" w:leader="dot" w:pos="9062"/>
         </w:tabs>
         <w:spacing w:line="480" w:lineRule="auto"/>
-        <w:ind w:left="-709" w:hanging="425"/>
+        <w:ind w:left="-709" w:firstLine="142"/>
         <w:rPr>
           <w:rFonts w:asciiTheme="minorHAnsi" w:hAnsiTheme="minorHAnsi"/>
           <w:noProof/>
@@ -5950,7 +5935,7 @@
             <w:noProof/>
             <w:sz w:val="22"/>
           </w:rPr>
-          <w:t>Figure 12:Batch size robustness curves showing validation F1-score, peak GPU memory, and gradient norm.</w:t>
+          <w:t>Figure 12:Batch size robustness curves showing validation F1-score, peak GPU memory</w:t>
         </w:r>
         <w:r>
           <w:rPr>
@@ -6011,7 +5996,7 @@
     </w:p>
     <w:p>
       <w:pPr>
-        <w:ind w:left="-709" w:hanging="567"/>
+        <w:ind w:left="-709" w:firstLine="142"/>
       </w:pPr>
       <w:r>
         <w:fldChar w:fldCharType="end"/>
@@ -6030,7 +6015,7 @@
     <w:p>
       <w:pPr>
         <w:spacing w:line="240" w:lineRule="auto"/>
-        <w:ind w:left="-1134"/>
+        <w:ind w:left="-567" w:right="-709"/>
         <w:rPr>
           <w:bCs/>
           <w:sz w:val="22"/>
@@ -6061,7 +6046,7 @@
     <w:p>
       <w:pPr>
         <w:spacing w:line="240" w:lineRule="auto"/>
-        <w:ind w:left="-1134"/>
+        <w:ind w:left="-567" w:right="-709"/>
         <w:rPr>
           <w:bCs/>
           <w:sz w:val="22"/>
@@ -6092,7 +6077,7 @@
     <w:p>
       <w:pPr>
         <w:spacing w:line="240" w:lineRule="auto"/>
-        <w:ind w:left="-1134"/>
+        <w:ind w:left="-567" w:right="-709"/>
         <w:rPr>
           <w:bCs/>
           <w:sz w:val="22"/>
@@ -6123,7 +6108,7 @@
     <w:p>
       <w:pPr>
         <w:spacing w:line="240" w:lineRule="auto"/>
-        <w:ind w:left="-1134"/>
+        <w:ind w:left="-567" w:right="-709"/>
         <w:rPr>
           <w:bCs/>
           <w:sz w:val="22"/>
@@ -6154,7 +6139,7 @@
     <w:p>
       <w:pPr>
         <w:spacing w:line="240" w:lineRule="auto"/>
-        <w:ind w:left="-1134"/>
+        <w:ind w:left="-567" w:right="-709"/>
         <w:rPr>
           <w:bCs/>
           <w:sz w:val="22"/>
@@ -6185,7 +6170,7 @@
     <w:p>
       <w:pPr>
         <w:spacing w:line="240" w:lineRule="auto"/>
-        <w:ind w:left="-1134"/>
+        <w:ind w:left="-567" w:right="-709"/>
       </w:pPr>
       <w:r>
         <w:rPr>
@@ -6256,23 +6241,7 @@
         <w:jc w:val="both"/>
       </w:pPr>
       <w:r>
-        <w:t xml:space="preserve">Since their introduction by Vaswani et al. (2017), Transformer architectures based entirely on self-attention mechanisms have revolutionized NLP, replacing recurrent networks (RNNs) and convolutional networks (CNNs). Models like BERT (Bidirectional Encoder Representations from Transformers) by Devlin et al. (2018) pre-train bidirectionally on vast text corpora, capturing rich contextual semantics. While BERT achieves remarkable generalizability, its high parameter count (~110 million for BERT-base) demands significant GPU memory and training time. To address this efficiency bottleneck, Sanh et al. (2019) introduced </w:t>
-      </w:r>
-      <w:proofErr w:type="spellStart"/>
-      <w:r>
-        <w:t>DistilBERT</w:t>
-      </w:r>
-      <w:proofErr w:type="spellEnd"/>
-      <w:r>
-        <w:t xml:space="preserve">, a compressed variant trained via knowledge distillation. </w:t>
-      </w:r>
-      <w:proofErr w:type="spellStart"/>
-      <w:r>
-        <w:t>DistilBERT</w:t>
-      </w:r>
-      <w:proofErr w:type="spellEnd"/>
-      <w:r>
-        <w:t xml:space="preserve"> reduces the parameter count by 40% while preserving 97% of BERT's language understanding capabilities, making it an ideal model for academic benchmarks and resource-constrained deployment.</w:t>
+        <w:t>Since their introduction by Vaswani et al. (2017), Transformer architectures based entirely on self-attention mechanisms have revolutionized NLP, replacing recurrent networks (RNNs) and convolutional networks (CNNs). Models like BERT (Bidirectional Encoder Representations from Transformers) by Devlin et al. (2018) pre-train bidirectionally on vast text corpora, capturing rich contextual semantics. While BERT achieves remarkable generalizability, its high parameter count (~110 million for BERT-base) demands significant GPU memory and training time. To address this efficiency bottleneck, Sanh et al. (2019) introduced DistilBERT, a compressed variant trained via knowledge distillation. DistilBERT reduces the parameter count by 40% while preserving 97% of BERT's language understanding capabilities, making it an ideal model for academic benchmarks and resource-constrained deployment.</w:t>
       </w:r>
     </w:p>
     <w:p>
@@ -6290,31 +6259,7 @@
         <w:jc w:val="both"/>
       </w:pPr>
       <w:r>
-        <w:t xml:space="preserve">The optimization landscape of Transformer networks is highly non-convex, characterized by sharp curvatures, flat basins, and numerous saddle points. Traditional non-adaptive optimization methods, such as Stochastic Gradient Descent (SGD), apply a uniform learning rate to all parameters. While SGD works well for vision models, it struggles in Transformers because different layers (such as the embedding matrix vs. the attention heads vs. the classification head) experience drastically different gradient scales. To overcome this, adaptive optimization methods (e.g., </w:t>
-      </w:r>
-      <w:proofErr w:type="spellStart"/>
-      <w:r>
-        <w:t>AdamW</w:t>
-      </w:r>
-      <w:proofErr w:type="spellEnd"/>
-      <w:r>
-        <w:t xml:space="preserve">, </w:t>
-      </w:r>
-      <w:proofErr w:type="spellStart"/>
-      <w:r>
-        <w:t>AdaFactor</w:t>
-      </w:r>
-      <w:proofErr w:type="spellEnd"/>
-      <w:r>
-        <w:t xml:space="preserve">, Lion) dynamically scale the learning rate for each individual parameter based on historical gradient moments. Decoupling weight decay from the gradient updates (as in </w:t>
-      </w:r>
-      <w:proofErr w:type="spellStart"/>
-      <w:r>
-        <w:t>AdamW</w:t>
-      </w:r>
-      <w:proofErr w:type="spellEnd"/>
-      <w:r>
-        <w:t>) further stabilizes regularization, making adaptive optimizers the default choice.</w:t>
+        <w:t>The optimization landscape of Transformer networks is highly non-convex, characterized by sharp curvatures, flat basins, and numerous saddle points. Traditional non-adaptive optimization methods, such as Stochastic Gradient Descent (SGD), apply a uniform learning rate to all parameters. While SGD works well for vision models, it struggles in Transformers because different layers (such as the embedding matrix vs. the attention heads vs. the classification head) experience drastically different gradient scales. To overcome this, adaptive optimization methods (e.g., AdamW, AdaFactor, Lion) dynamically scale the learning rate for each individual parameter based on historical gradient moments. Decoupling weight decay from the gradient updates (as in AdamW) further stabilizes regularization, making adaptive optimizers the default choice.</w:t>
       </w:r>
     </w:p>
     <w:p>
@@ -6332,31 +6277,7 @@
         <w:jc w:val="both"/>
       </w:pPr>
       <w:r>
-        <w:t xml:space="preserve">The primary goal of this research is to carry out a rigorous empirical study comparing five optimization methods for fine-tuning </w:t>
-      </w:r>
-      <w:proofErr w:type="spellStart"/>
-      <w:r>
-        <w:t>DistilBERT</w:t>
-      </w:r>
-      <w:proofErr w:type="spellEnd"/>
-      <w:r>
-        <w:t xml:space="preserve"> on the IMDB sentiment classification task. We compare a non-adaptive baseline (SGD with Momentum) against four modern adaptive methods: </w:t>
-      </w:r>
-      <w:proofErr w:type="spellStart"/>
-      <w:r>
-        <w:t>AdamW</w:t>
-      </w:r>
-      <w:proofErr w:type="spellEnd"/>
-      <w:r>
-        <w:t xml:space="preserve">, </w:t>
-      </w:r>
-      <w:proofErr w:type="spellStart"/>
-      <w:r>
-        <w:t>AdaFactor</w:t>
-      </w:r>
-      <w:proofErr w:type="spellEnd"/>
-      <w:r>
-        <w:t>, LAMB, and Lion. Our objectives are to analyze their convergence speed, learning rate sensitivity, batch size robustness, memory efficiency, and internal layer-wise gradient dynamics. This multi-dimensional evaluation will help identify the optimal trade-off between task performance and resource efficiency.</w:t>
+        <w:t>The primary goal of this research is to carry out a rigorous empirical study comparing five optimization methods for fine-tuning DistilBERT on the IMDB sentiment classification task. We compare a non-adaptive baseline (SGD with Momentum) against four modern adaptive methods: AdamW, AdaFactor, LAMB, and Lion. Our objectives are to analyze their convergence speed, learning rate sensitivity, batch size robustness, memory efficiency, and internal layer-wise gradient dynamics. This multi-dimensional evaluation will help identify the optimal trade-off between task performance and resource efficiency.</w:t>
       </w:r>
     </w:p>
     <w:p>
@@ -6385,15 +6306,7 @@
         <w:jc w:val="both"/>
       </w:pPr>
       <w:r>
-        <w:t xml:space="preserve">Optimization in deep learning has evolved from simple first-order descent algorithms to complex adaptive schemes. The standard Adam optimizer, proposed by Kingma &amp; Ba (2014), combined the concepts of momentum and adaptive learning rates, quickly becoming the standard for deep neural networks. However, Loshchilov &amp; Hutter (2017) demonstrated that the traditional L2 regularization implementation in Adam leads to suboptimal generalization because the weight decay is scaled by the inverse of the gradient variance. They proposed </w:t>
-      </w:r>
-      <w:proofErr w:type="spellStart"/>
-      <w:r>
-        <w:t>AdamW</w:t>
-      </w:r>
-      <w:proofErr w:type="spellEnd"/>
-      <w:r>
-        <w:t>, which decouples the weight decay update, yielding substantial generalization gains in NLP tasks.</w:t>
+        <w:t>Optimization in deep learning has evolved from simple first-order descent algorithms to complex adaptive schemes. The standard Adam optimizer, proposed by Kingma &amp; Ba (2014), combined the concepts of momentum and adaptive learning rates, quickly becoming the standard for deep neural networks. However, Loshchilov &amp; Hutter (2017) demonstrated that the traditional L2 regularization implementation in Adam leads to suboptimal generalization because the weight decay is scaled by the inverse of the gradient variance. They proposed AdamW, which decouples the weight decay update, yielding substantial generalization gains in NLP tasks.</w:t>
       </w:r>
     </w:p>
     <w:p>
@@ -6401,31 +6314,7 @@
         <w:jc w:val="both"/>
       </w:pPr>
       <w:r>
-        <w:t xml:space="preserve">To mitigate the high GPU memory overhead of storing running moments for millions of parameters, </w:t>
-      </w:r>
-      <w:proofErr w:type="spellStart"/>
-      <w:r>
-        <w:t>Shazeer</w:t>
-      </w:r>
-      <w:proofErr w:type="spellEnd"/>
-      <w:r>
-        <w:t xml:space="preserve"> &amp; Stern (2018) introduced </w:t>
-      </w:r>
-      <w:proofErr w:type="spellStart"/>
-      <w:r>
-        <w:t>AdaFactor</w:t>
-      </w:r>
-      <w:proofErr w:type="spellEnd"/>
-      <w:r>
-        <w:t xml:space="preserve">. By factorizing the second-moment accumulator matrix, </w:t>
-      </w:r>
-      <w:proofErr w:type="spellStart"/>
-      <w:r>
-        <w:t>AdaFactor</w:t>
-      </w:r>
-      <w:proofErr w:type="spellEnd"/>
-      <w:r>
-        <w:t xml:space="preserve"> achieves sublinear memory complexity. For large-scale distributed training, </w:t>
+        <w:t xml:space="preserve">To mitigate the high GPU memory overhead of storing running moments for millions of parameters, Shazeer &amp; Stern (2018) introduced AdaFactor. By factorizing the second-moment accumulator matrix, AdaFactor achieves sublinear memory complexity. For large-scale distributed training, </w:t>
       </w:r>
       <w:proofErr w:type="gramStart"/>
       <w:r>
@@ -6604,11 +6493,9 @@
             </w:tcMar>
           </w:tcPr>
           <w:p>
-            <w:proofErr w:type="spellStart"/>
             <w:r>
               <w:t>AdamW</w:t>
             </w:r>
-            <w:proofErr w:type="spellEnd"/>
           </w:p>
         </w:tc>
         <w:tc>
@@ -6662,13 +6549,8 @@
             </w:tcMar>
           </w:tcPr>
           <w:p>
-            <w:proofErr w:type="spellStart"/>
-            <w:r>
-              <w:t>Shazeer</w:t>
-            </w:r>
-            <w:proofErr w:type="spellEnd"/>
-            <w:r>
-              <w:t xml:space="preserve"> &amp; Stern (2018)</w:t>
+            <w:r>
+              <w:t>Shazeer &amp; Stern (2018)</w:t>
             </w:r>
           </w:p>
         </w:tc>
@@ -6684,11 +6566,9 @@
             </w:tcMar>
           </w:tcPr>
           <w:p>
-            <w:proofErr w:type="spellStart"/>
             <w:r>
               <w:t>AdaFactor</w:t>
             </w:r>
-            <w:proofErr w:type="spellEnd"/>
           </w:p>
         </w:tc>
         <w:tc>
@@ -7838,15 +7718,7 @@
       </w:pPr>
       <w:bookmarkStart w:id="17" w:name="_Toc232863540"/>
       <w:r>
-        <w:t xml:space="preserve">2.3.2 </w:t>
-      </w:r>
-      <w:proofErr w:type="spellStart"/>
-      <w:r>
-        <w:t>AdamW</w:t>
-      </w:r>
-      <w:proofErr w:type="spellEnd"/>
-      <w:r>
-        <w:t xml:space="preserve"> (Decoupled Weight Decay)</w:t>
+        <w:t>2.3.2 AdamW (Decoupled Weight Decay)</w:t>
       </w:r>
       <w:bookmarkEnd w:id="17"/>
     </w:p>
@@ -7855,15 +7727,7 @@
         <w:jc w:val="both"/>
       </w:pPr>
       <w:r>
-        <w:t xml:space="preserve">Principle and Intuition: </w:t>
-      </w:r>
-      <w:proofErr w:type="spellStart"/>
-      <w:r>
-        <w:t>AdamW</w:t>
-      </w:r>
-      <w:proofErr w:type="spellEnd"/>
-      <w:r>
-        <w:t xml:space="preserve"> is an extension of Adam that decouples weight decay from the adaptive gradient updates. By tracking both the first and second moments of the gradients, it adjusts the step size coordinate-wise, which stabilizes training on complex topologies. Decoupling weight decay prevents L2 regularization from being scaled by the historical gradient variance, restoring the effectiveness of regularizing the model parameters. The update sequence is formulated below:</w:t>
+        <w:t>Principle and Intuition: AdamW is an extension of Adam that decouples weight decay from the adaptive gradient updates. By tracking both the first and second moments of the gradients, it adjusts the step size coordinate-wise, which stabilizes training on complex topologies. Decoupling weight decay prevents L2 regularization from being scaled by the historical gradient variance, restoring the effectiveness of regularizing the model parameters. The update sequence is formulated below:</w:t>
       </w:r>
     </w:p>
     <w:tbl>
@@ -10247,21 +10111,7 @@
         <w:rPr>
           <w:rStyle w:val="Titre3Car"/>
         </w:rPr>
-        <w:t xml:space="preserve">2.3.3 </w:t>
-      </w:r>
-      <w:proofErr w:type="spellStart"/>
-      <w:r>
-        <w:rPr>
-          <w:rStyle w:val="Titre3Car"/>
-        </w:rPr>
-        <w:t>AdaFactor</w:t>
-      </w:r>
-      <w:proofErr w:type="spellEnd"/>
-      <w:r>
-        <w:rPr>
-          <w:rStyle w:val="Titre3Car"/>
-        </w:rPr>
-        <w:t xml:space="preserve"> (Sublinear Memory Cost)</w:t>
+        <w:t>2.3.3 AdaFactor (Sublinear Memory Cost)</w:t>
       </w:r>
       <w:bookmarkEnd w:id="21"/>
       <w:r>
@@ -10271,31 +10121,7 @@
         <w:br/>
       </w:r>
       <w:r>
-        <w:t xml:space="preserve">Principle and Intuition: </w:t>
-      </w:r>
-      <w:proofErr w:type="spellStart"/>
-      <w:r>
-        <w:t>AdaFactor</w:t>
-      </w:r>
-      <w:proofErr w:type="spellEnd"/>
-      <w:r>
-        <w:t xml:space="preserve"> is designed to reduce the memory footprint of storing second-moment estimates during large-scale Transformer training. While </w:t>
-      </w:r>
-      <w:proofErr w:type="spellStart"/>
-      <w:r>
-        <w:t>AdamW</w:t>
-      </w:r>
-      <w:proofErr w:type="spellEnd"/>
-      <w:r>
-        <w:t xml:space="preserve"> requires storing a second-moment tensor of size equivalent to the model parameters, </w:t>
-      </w:r>
-      <w:proofErr w:type="spellStart"/>
-      <w:r>
-        <w:t>AdaFactor</w:t>
-      </w:r>
-      <w:proofErr w:type="spellEnd"/>
-      <w:r>
-        <w:t xml:space="preserve"> factorizes the second-moment accumulator matrix along the row and column dimensions. This factorization reduces memory complexity from quadratic to sublinear, while maintaining comparable convergence properties. The update steps are formulated as follows:</w:t>
+        <w:t>Principle and Intuition: AdaFactor is designed to reduce the memory footprint of storing second-moment estimates during large-scale Transformer training. While AdamW requires storing a second-moment tensor of size equivalent to the model parameters, AdaFactor factorizes the second-moment accumulator matrix along the row and column dimensions. This factorization reduces memory complexity from quadratic to sublinear, while maintaining comparable convergence properties. The update steps are formulated as follows:</w:t>
       </w:r>
     </w:p>
     <w:p>
@@ -10710,21 +10536,7 @@
         <w:rPr>
           <w:szCs w:val="24"/>
         </w:rPr>
-        <w:t xml:space="preserve">row-wise second-moment accumulator vector at index </w:t>
-      </w:r>
-      <w:proofErr w:type="spellStart"/>
-      <w:r>
-        <w:rPr>
-          <w:szCs w:val="24"/>
-        </w:rPr>
-        <w:t>i</w:t>
-      </w:r>
-      <w:proofErr w:type="spellEnd"/>
-      <w:r>
-        <w:rPr>
-          <w:szCs w:val="24"/>
-        </w:rPr>
-        <w:t xml:space="preserve"> and step t</w:t>
+        <w:t>row-wise second-moment accumulator vector at index i and step t</w:t>
       </w:r>
     </w:p>
     <w:p>
@@ -10859,21 +10671,7 @@
         <w:rPr>
           <w:szCs w:val="24"/>
         </w:rPr>
-        <w:t xml:space="preserve">squared gradient for the parameter at row </w:t>
-      </w:r>
-      <w:proofErr w:type="spellStart"/>
-      <w:r>
-        <w:rPr>
-          <w:szCs w:val="24"/>
-        </w:rPr>
-        <w:t>i</w:t>
-      </w:r>
-      <w:proofErr w:type="spellEnd"/>
-      <w:r>
-        <w:rPr>
-          <w:szCs w:val="24"/>
-        </w:rPr>
-        <w:t xml:space="preserve"> and column j</w:t>
+        <w:t>squared gradient for the parameter at row i and column j</w:t>
       </w:r>
     </w:p>
     <w:p>
@@ -10897,21 +10695,7 @@
         <w:rPr>
           <w:szCs w:val="24"/>
         </w:rPr>
-        <w:t xml:space="preserve"> computes the row-wise running average of the squared gradients for a 2D parameter matrix. By accumulating variance along the rows rather than tracking each parameter coordinate independently, </w:t>
-      </w:r>
-      <w:proofErr w:type="spellStart"/>
-      <w:r>
-        <w:rPr>
-          <w:szCs w:val="24"/>
-        </w:rPr>
-        <w:t>AdaFactor</w:t>
-      </w:r>
-      <w:proofErr w:type="spellEnd"/>
-      <w:r>
-        <w:rPr>
-          <w:szCs w:val="24"/>
-        </w:rPr>
-        <w:t xml:space="preserve"> reduces the memory requirement of the second moment from quadratic to sublinear.</w:t>
+        <w:t xml:space="preserve"> computes the row-wise running average of the squared gradients for a 2D parameter matrix. By accumulating variance along the rows rather than tracking each parameter coordinate independently, AdaFactor reduces the memory requirement of the second moment from quadratic to sublinear.</w:t>
       </w:r>
     </w:p>
     <w:tbl>
@@ -11463,21 +11247,7 @@
         <w:rPr>
           <w:szCs w:val="24"/>
         </w:rPr>
-        <w:t xml:space="preserve">squared gradient for the parameter at row </w:t>
-      </w:r>
-      <w:proofErr w:type="spellStart"/>
-      <w:r>
-        <w:rPr>
-          <w:szCs w:val="24"/>
-        </w:rPr>
-        <w:t>i</w:t>
-      </w:r>
-      <w:proofErr w:type="spellEnd"/>
-      <w:r>
-        <w:rPr>
-          <w:szCs w:val="24"/>
-        </w:rPr>
-        <w:t xml:space="preserve"> and column j</w:t>
+        <w:t>squared gradient for the parameter at row i and column j</w:t>
       </w:r>
     </w:p>
     <w:p>
@@ -11885,21 +11655,7 @@
         <w:rPr>
           <w:szCs w:val="24"/>
         </w:rPr>
-        <w:t>reconstructed factorized second-moment estimate for cell (</w:t>
-      </w:r>
-      <w:proofErr w:type="spellStart"/>
-      <w:r>
-        <w:rPr>
-          <w:szCs w:val="24"/>
-        </w:rPr>
-        <w:t>i</w:t>
-      </w:r>
-      <w:proofErr w:type="spellEnd"/>
-      <w:r>
-        <w:rPr>
-          <w:szCs w:val="24"/>
-        </w:rPr>
-        <w:t>, j) at step t</w:t>
+        <w:t>reconstructed factorized second-moment estimate for cell (i, j) at step t</w:t>
       </w:r>
     </w:p>
     <w:p>
@@ -11940,16 +11696,8 @@
         <w:rPr>
           <w:szCs w:val="24"/>
         </w:rPr>
-        <w:t xml:space="preserve">row accumulator value at row index </w:t>
-      </w:r>
-      <w:proofErr w:type="spellStart"/>
-      <w:r>
-        <w:rPr>
-          <w:szCs w:val="24"/>
-        </w:rPr>
-        <w:t>i</w:t>
-      </w:r>
-      <w:proofErr w:type="spellEnd"/>
+        <w:t>row accumulator value at row index i</w:t>
+      </w:r>
     </w:p>
     <w:p>
       <w:pPr>
@@ -12928,21 +12676,7 @@
         <w:rPr>
           <w:szCs w:val="24"/>
         </w:rPr>
-        <w:t xml:space="preserve">Equation (2.11) applies the parameter update by subtracting the normalized gradient step while applying decoupled weight decay. This update rule enables stable convergence comparable to </w:t>
-      </w:r>
-      <w:proofErr w:type="spellStart"/>
-      <w:r>
-        <w:rPr>
-          <w:szCs w:val="24"/>
-        </w:rPr>
-        <w:t>AdamW</w:t>
-      </w:r>
-      <w:proofErr w:type="spellEnd"/>
-      <w:r>
-        <w:rPr>
-          <w:szCs w:val="24"/>
-        </w:rPr>
-        <w:t xml:space="preserve"> while reducing peak memory requirements, facilitating the fine-tuning of large Transformer models under GPU limits.</w:t>
+        <w:t>Equation (2.11) applies the parameter update by subtracting the normalized gradient step while applying decoupled weight decay. This update rule enables stable convergence comparable to AdamW while reducing peak memory requirements, facilitating the fine-tuning of large Transformer models under GPU limits.</w:t>
       </w:r>
     </w:p>
     <w:p>
@@ -13379,7 +13113,6 @@
           <w:szCs w:val="24"/>
         </w:rPr>
       </w:pPr>
-      <w:proofErr w:type="spellStart"/>
       <w:r>
         <w:rPr>
           <w:b/>
@@ -13395,16 +13128,7 @@
           <w:color w:val="7030A0"/>
           <w:szCs w:val="24"/>
         </w:rPr>
-        <w:t>ˡ</w:t>
-      </w:r>
-      <w:proofErr w:type="spellEnd"/>
-      <w:r>
-        <w:rPr>
-          <w:b/>
-          <w:color w:val="7030A0"/>
-          <w:szCs w:val="24"/>
-        </w:rPr>
-        <w:t xml:space="preserve"> :</w:t>
+        <w:t>ˡ :</w:t>
       </w:r>
       <w:proofErr w:type="gramEnd"/>
       <w:r>
@@ -13583,7 +13307,6 @@
           <w:szCs w:val="24"/>
         </w:rPr>
       </w:pPr>
-      <w:proofErr w:type="spellStart"/>
       <w:r>
         <w:rPr>
           <w:b/>
@@ -13599,16 +13322,7 @@
           <w:color w:val="7030A0"/>
           <w:szCs w:val="24"/>
         </w:rPr>
-        <w:t>ˡ</w:t>
-      </w:r>
-      <w:proofErr w:type="spellEnd"/>
-      <w:r>
-        <w:rPr>
-          <w:b/>
-          <w:color w:val="7030A0"/>
-          <w:szCs w:val="24"/>
-        </w:rPr>
-        <w:t xml:space="preserve"> :</w:t>
+        <w:t>ˡ :</w:t>
       </w:r>
       <w:proofErr w:type="gramEnd"/>
       <w:r>
@@ -14043,7 +13757,6 @@
           <w:szCs w:val="24"/>
         </w:rPr>
       </w:pPr>
-      <w:proofErr w:type="spellStart"/>
       <w:r>
         <w:rPr>
           <w:b/>
@@ -14060,16 +13773,7 @@
           <w:color w:val="7030A0"/>
           <w:szCs w:val="24"/>
         </w:rPr>
-        <w:t>ˡ</w:t>
-      </w:r>
-      <w:proofErr w:type="spellEnd"/>
-      <w:r>
-        <w:rPr>
-          <w:b/>
-          <w:color w:val="7030A0"/>
-          <w:szCs w:val="24"/>
-        </w:rPr>
-        <w:t xml:space="preserve"> :</w:t>
+        <w:t>ˡ :</w:t>
       </w:r>
       <w:proofErr w:type="gramEnd"/>
       <w:r>
@@ -14103,23 +13807,13 @@
         </w:rPr>
         <w:t>‖</w:t>
       </w:r>
-      <w:proofErr w:type="spellStart"/>
       <w:r>
         <w:rPr>
           <w:b/>
           <w:color w:val="7030A0"/>
           <w:szCs w:val="24"/>
         </w:rPr>
-        <w:t>θₜˡ</w:t>
-      </w:r>
-      <w:proofErr w:type="spellEnd"/>
-      <w:r>
-        <w:rPr>
-          <w:b/>
-          <w:color w:val="7030A0"/>
-          <w:szCs w:val="24"/>
-        </w:rPr>
-        <w:t>‖</w:t>
+        <w:t>θₜˡ‖</w:t>
       </w:r>
       <w:proofErr w:type="gramStart"/>
       <w:r>
@@ -14167,58 +13861,32 @@
           <w:color w:val="7030A0"/>
           <w:szCs w:val="24"/>
         </w:rPr>
-        <w:t>‖</w:t>
-      </w:r>
-      <w:proofErr w:type="spellStart"/>
+        <w:t>‖uₜˡ‖</w:t>
+      </w:r>
+      <w:proofErr w:type="gramStart"/>
       <w:r>
         <w:rPr>
           <w:b/>
           <w:color w:val="7030A0"/>
           <w:szCs w:val="24"/>
         </w:rPr>
-        <w:t>uₜˡ</w:t>
-      </w:r>
-      <w:proofErr w:type="spellEnd"/>
+        <w:t>₂ :</w:t>
+      </w:r>
+      <w:proofErr w:type="gramEnd"/>
       <w:r>
         <w:rPr>
           <w:b/>
           <w:color w:val="7030A0"/>
           <w:szCs w:val="24"/>
         </w:rPr>
-        <w:t>‖</w:t>
-      </w:r>
-      <w:proofErr w:type="gramStart"/>
-      <w:r>
-        <w:rPr>
-          <w:b/>
-          <w:color w:val="7030A0"/>
-          <w:szCs w:val="24"/>
-        </w:rPr>
-        <w:t>₂ :</w:t>
-      </w:r>
-      <w:proofErr w:type="gramEnd"/>
-      <w:r>
-        <w:rPr>
-          <w:b/>
-          <w:color w:val="7030A0"/>
-          <w:szCs w:val="24"/>
-        </w:rPr>
         <w:t xml:space="preserve"> </w:t>
       </w:r>
       <w:r>
         <w:rPr>
           <w:szCs w:val="24"/>
         </w:rPr>
-        <w:t xml:space="preserve">L2 norm of the proposed base update vector </w:t>
-      </w:r>
-      <w:proofErr w:type="spellStart"/>
-      <w:r>
-        <w:rPr>
-          <w:szCs w:val="24"/>
-        </w:rPr>
-        <w:t>uₜˡ</w:t>
-      </w:r>
-      <w:proofErr w:type="spellEnd"/>
+        <w:t>L2 norm of the proposed base update vector uₜˡ</w:t>
+      </w:r>
     </w:p>
     <w:p>
       <w:pPr>
@@ -14625,7 +14293,6 @@
           <w:szCs w:val="24"/>
         </w:rPr>
       </w:pPr>
-      <w:proofErr w:type="spellStart"/>
       <w:r>
         <w:rPr>
           <w:b/>
@@ -14641,16 +14308,7 @@
           <w:color w:val="7030A0"/>
           <w:szCs w:val="24"/>
         </w:rPr>
-        <w:t>ˡ</w:t>
-      </w:r>
-      <w:proofErr w:type="spellEnd"/>
-      <w:r>
-        <w:rPr>
-          <w:b/>
-          <w:color w:val="7030A0"/>
-          <w:szCs w:val="24"/>
-        </w:rPr>
-        <w:t xml:space="preserve"> :</w:t>
+        <w:t>ˡ :</w:t>
       </w:r>
       <w:proofErr w:type="gramEnd"/>
       <w:r>
@@ -14711,7 +14369,6 @@
           <w:szCs w:val="24"/>
         </w:rPr>
       </w:pPr>
-      <w:proofErr w:type="spellStart"/>
       <w:r>
         <w:rPr>
           <w:b/>
@@ -14727,16 +14384,7 @@
           <w:color w:val="7030A0"/>
           <w:szCs w:val="24"/>
         </w:rPr>
-        <w:t>ˡ</w:t>
-      </w:r>
-      <w:proofErr w:type="spellEnd"/>
-      <w:r>
-        <w:rPr>
-          <w:b/>
-          <w:color w:val="7030A0"/>
-          <w:szCs w:val="24"/>
-        </w:rPr>
-        <w:t xml:space="preserve"> :</w:t>
+        <w:t>ˡ :</w:t>
       </w:r>
       <w:proofErr w:type="gramEnd"/>
       <w:r>
@@ -14763,7 +14411,6 @@
           <w:szCs w:val="24"/>
         </w:rPr>
       </w:pPr>
-      <w:proofErr w:type="spellStart"/>
       <w:r>
         <w:rPr>
           <w:b/>
@@ -14779,16 +14426,7 @@
           <w:color w:val="7030A0"/>
           <w:szCs w:val="24"/>
         </w:rPr>
-        <w:t>ˡ</w:t>
-      </w:r>
-      <w:proofErr w:type="spellEnd"/>
-      <w:r>
-        <w:rPr>
-          <w:b/>
-          <w:color w:val="7030A0"/>
-          <w:szCs w:val="24"/>
-        </w:rPr>
-        <w:t xml:space="preserve"> :</w:t>
+        <w:t>ˡ :</w:t>
       </w:r>
       <w:proofErr w:type="gramEnd"/>
       <w:r>
@@ -14826,21 +14464,7 @@
         <w:rPr>
           <w:szCs w:val="24"/>
         </w:rPr>
-        <w:t xml:space="preserve"> updates the parameters of layer l by scaling the adaptive update vector by the layer's trust ratio </w:t>
-      </w:r>
-      <w:proofErr w:type="spellStart"/>
-      <w:r>
-        <w:rPr>
-          <w:szCs w:val="24"/>
-        </w:rPr>
-        <w:t>ϕₜˡ</w:t>
-      </w:r>
-      <w:proofErr w:type="spellEnd"/>
-      <w:r>
-        <w:rPr>
-          <w:szCs w:val="24"/>
-        </w:rPr>
-        <w:t>. This layer-wise step matching maintains stability and prevents gradient explosion or divergence, even when training with large batch sizes.</w:t>
+        <w:t xml:space="preserve"> updates the parameters of layer l by scaling the adaptive update vector by the layer's trust ratio ϕₜˡ. This layer-wise step matching maintains stability and prevents gradient explosion or divergence, even when training with large batch sizes.</w:t>
       </w:r>
     </w:p>
     <w:p>
@@ -14849,21 +14473,7 @@
         <w:rPr>
           <w:rStyle w:val="Titre3Car"/>
         </w:rPr>
-        <w:t>2.3.5 Lion (</w:t>
-      </w:r>
-      <w:proofErr w:type="spellStart"/>
-      <w:r>
-        <w:rPr>
-          <w:rStyle w:val="Titre3Car"/>
-        </w:rPr>
-        <w:t>EvoLved</w:t>
-      </w:r>
-      <w:proofErr w:type="spellEnd"/>
-      <w:r>
-        <w:rPr>
-          <w:rStyle w:val="Titre3Car"/>
-        </w:rPr>
-        <w:t xml:space="preserve"> Sign Momentum)</w:t>
+        <w:t>2.3.5 Lion (EvoLved Sign Momentum)</w:t>
       </w:r>
       <w:bookmarkEnd w:id="23"/>
       <w:r>
@@ -16378,21 +15988,7 @@
         <w:rPr>
           <w:szCs w:val="24"/>
         </w:rPr>
-        <w:t xml:space="preserve"> a single moment vector (instead of two as in </w:t>
-      </w:r>
-      <w:proofErr w:type="spellStart"/>
-      <w:r>
-        <w:rPr>
-          <w:szCs w:val="24"/>
-        </w:rPr>
-        <w:t>AdamW</w:t>
-      </w:r>
-      <w:proofErr w:type="spellEnd"/>
-      <w:r>
-        <w:rPr>
-          <w:szCs w:val="24"/>
-        </w:rPr>
-        <w:t>), Lion reduces the memory footprint, saving GPU memory in resource-constrained training environments.</w:t>
+        <w:t xml:space="preserve"> a single moment vector (instead of two as in AdamW), Lion reduces the memory footprint, saving GPU memory in resource-constrained training environments.</w:t>
       </w:r>
     </w:p>
     <w:p>
@@ -16401,21 +15997,7 @@
         <w:rPr>
           <w:rStyle w:val="Titre2Car"/>
         </w:rPr>
-        <w:t xml:space="preserve">2.4 BERT and </w:t>
-      </w:r>
-      <w:proofErr w:type="spellStart"/>
-      <w:r>
-        <w:rPr>
-          <w:rStyle w:val="Titre2Car"/>
-        </w:rPr>
-        <w:t>DistilBERT</w:t>
-      </w:r>
-      <w:proofErr w:type="spellEnd"/>
-      <w:r>
-        <w:rPr>
-          <w:rStyle w:val="Titre2Car"/>
-        </w:rPr>
-        <w:t xml:space="preserve"> Language Modeling</w:t>
+        <w:t>2.4 BERT and DistilBERT Language Modeling</w:t>
       </w:r>
       <w:bookmarkEnd w:id="24"/>
       <w:r>
@@ -16852,7 +16434,6 @@
           <w:szCs w:val="24"/>
         </w:rPr>
       </w:pPr>
-      <w:proofErr w:type="spellStart"/>
       <w:proofErr w:type="gramStart"/>
       <w:r>
         <w:rPr>
@@ -16860,45 +16441,22 @@
           <w:color w:val="7030A0"/>
           <w:szCs w:val="24"/>
         </w:rPr>
-        <w:t>softmax</w:t>
-      </w:r>
-      <w:proofErr w:type="spellEnd"/>
+        <w:t>softmax :</w:t>
+      </w:r>
+      <w:proofErr w:type="gramEnd"/>
       <w:r>
         <w:rPr>
           <w:b/>
           <w:color w:val="7030A0"/>
           <w:szCs w:val="24"/>
         </w:rPr>
-        <w:t xml:space="preserve"> :</w:t>
-      </w:r>
-      <w:proofErr w:type="gramEnd"/>
-      <w:r>
-        <w:rPr>
-          <w:b/>
-          <w:color w:val="7030A0"/>
-          <w:szCs w:val="24"/>
-        </w:rPr>
         <w:t xml:space="preserve"> </w:t>
       </w:r>
       <w:r>
         <w:rPr>
           <w:szCs w:val="24"/>
         </w:rPr>
-        <w:t xml:space="preserve">row-wise </w:t>
-      </w:r>
-      <w:proofErr w:type="spellStart"/>
-      <w:r>
-        <w:rPr>
-          <w:szCs w:val="24"/>
-        </w:rPr>
-        <w:t>softmax</w:t>
-      </w:r>
-      <w:proofErr w:type="spellEnd"/>
-      <w:r>
-        <w:rPr>
-          <w:szCs w:val="24"/>
-        </w:rPr>
-        <w:t xml:space="preserve"> activation function</w:t>
+        <w:t>row-wise softmax activation function</w:t>
       </w:r>
     </w:p>
     <w:p>
@@ -16914,21 +16472,7 @@
           <w:szCs w:val="24"/>
         </w:rPr>
         <w:lastRenderedPageBreak/>
-        <w:t xml:space="preserve">Equation (2.18) computes the scaled dot-product attention, allowing tokens to dynamically focus on relevant context in the sequence. The scaling factor √dₖ prevents the dot products from growing too large, which would cause the </w:t>
-      </w:r>
-      <w:proofErr w:type="spellStart"/>
-      <w:r>
-        <w:rPr>
-          <w:szCs w:val="24"/>
-        </w:rPr>
-        <w:t>softmax</w:t>
-      </w:r>
-      <w:proofErr w:type="spellEnd"/>
-      <w:r>
-        <w:rPr>
-          <w:szCs w:val="24"/>
-        </w:rPr>
-        <w:t xml:space="preserve"> gradients to vanish and stall training.</w:t>
+        <w:t>Equation (2.18) computes the scaled dot-product attention, allowing tokens to dynamically focus on relevant context in the sequence. The scaling factor √dₖ prevents the dot products from growing too large, which would cause the softmax gradients to vanish and stall training.</w:t>
       </w:r>
     </w:p>
     <w:tbl>
@@ -16988,7 +16532,6 @@
                 <w:bCs/>
               </w:rPr>
             </w:pPr>
-            <w:proofErr w:type="spellStart"/>
             <m:oMathPara>
               <m:oMath>
                 <m:r>
@@ -17002,7 +16545,6 @@
                   </w:rPr>
                   <m:t>MultiHead</m:t>
                 </m:r>
-                <w:proofErr w:type="spellEnd"/>
                 <m:d>
                   <m:dPr>
                     <m:ctrlPr>
@@ -17246,7 +16788,6 @@
           <w:szCs w:val="24"/>
         </w:rPr>
       </w:pPr>
-      <w:proofErr w:type="spellStart"/>
       <w:proofErr w:type="gramStart"/>
       <w:r>
         <w:rPr>
@@ -17254,16 +16795,7 @@
           <w:color w:val="7030A0"/>
           <w:szCs w:val="24"/>
         </w:rPr>
-        <w:t>MultiHead</w:t>
-      </w:r>
-      <w:proofErr w:type="spellEnd"/>
-      <w:r>
-        <w:rPr>
-          <w:b/>
-          <w:color w:val="7030A0"/>
-          <w:szCs w:val="24"/>
-        </w:rPr>
-        <w:t>(</w:t>
+        <w:t>MultiHead(</w:t>
       </w:r>
       <w:proofErr w:type="gramEnd"/>
       <w:r>
@@ -17330,21 +16862,7 @@
         <w:rPr>
           <w:szCs w:val="24"/>
         </w:rPr>
-        <w:t xml:space="preserve">output of the </w:t>
-      </w:r>
-      <w:proofErr w:type="spellStart"/>
-      <w:r>
-        <w:rPr>
-          <w:szCs w:val="24"/>
-        </w:rPr>
-        <w:t>i-th</w:t>
-      </w:r>
-      <w:proofErr w:type="spellEnd"/>
-      <w:r>
-        <w:rPr>
-          <w:szCs w:val="24"/>
-        </w:rPr>
-        <w:t xml:space="preserve"> individual attention head</w:t>
+        <w:t>output of the i-th individual attention head</w:t>
       </w:r>
     </w:p>
     <w:p>
@@ -17424,7 +16942,6 @@
           <w:szCs w:val="24"/>
         </w:rPr>
       </w:pPr>
-      <w:proofErr w:type="spellStart"/>
       <w:proofErr w:type="gramStart"/>
       <w:r>
         <w:rPr>
@@ -17432,16 +16949,7 @@
           <w:color w:val="7030A0"/>
           <w:szCs w:val="24"/>
         </w:rPr>
-        <w:t>Concat</w:t>
-      </w:r>
-      <w:proofErr w:type="spellEnd"/>
-      <w:r>
-        <w:rPr>
-          <w:b/>
-          <w:color w:val="7030A0"/>
-          <w:szCs w:val="24"/>
-        </w:rPr>
-        <w:t xml:space="preserve"> :</w:t>
+        <w:t>Concat :</w:t>
       </w:r>
       <w:proofErr w:type="gramEnd"/>
       <w:r>
@@ -17879,21 +17387,7 @@
         <w:rPr>
           <w:szCs w:val="24"/>
         </w:rPr>
-        <w:t xml:space="preserve">computed output vector for the </w:t>
-      </w:r>
-      <w:proofErr w:type="spellStart"/>
-      <w:r>
-        <w:rPr>
-          <w:szCs w:val="24"/>
-        </w:rPr>
-        <w:t>i-th</w:t>
-      </w:r>
-      <w:proofErr w:type="spellEnd"/>
-      <w:r>
-        <w:rPr>
-          <w:szCs w:val="24"/>
-        </w:rPr>
-        <w:t xml:space="preserve"> attention head</w:t>
+        <w:t>computed output vector for the i-th attention head</w:t>
       </w:r>
     </w:p>
     <w:p>
@@ -17977,16 +17471,8 @@
         <w:rPr>
           <w:szCs w:val="24"/>
         </w:rPr>
-        <w:t xml:space="preserve">learned linear projection matrix for queries in head </w:t>
-      </w:r>
-      <w:proofErr w:type="spellStart"/>
-      <w:r>
-        <w:rPr>
-          <w:szCs w:val="24"/>
-        </w:rPr>
-        <w:t>i</w:t>
-      </w:r>
-      <w:proofErr w:type="spellEnd"/>
+        <w:t>learned linear projection matrix for queries in head i</w:t>
+      </w:r>
     </w:p>
     <w:p>
       <w:pPr>
@@ -18025,16 +17511,8 @@
         <w:rPr>
           <w:szCs w:val="24"/>
         </w:rPr>
-        <w:t xml:space="preserve">learned linear projection matrix for keys in head </w:t>
-      </w:r>
-      <w:proofErr w:type="spellStart"/>
-      <w:r>
-        <w:rPr>
-          <w:szCs w:val="24"/>
-        </w:rPr>
-        <w:t>i</w:t>
-      </w:r>
-      <w:proofErr w:type="spellEnd"/>
+        <w:t>learned linear projection matrix for keys in head i</w:t>
+      </w:r>
     </w:p>
     <w:p>
       <w:pPr>
@@ -18067,16 +17545,8 @@
         <w:rPr>
           <w:szCs w:val="24"/>
         </w:rPr>
-        <w:t xml:space="preserve">learned linear projection matrix for values in head </w:t>
-      </w:r>
-      <w:proofErr w:type="spellStart"/>
-      <w:r>
-        <w:rPr>
-          <w:szCs w:val="24"/>
-        </w:rPr>
-        <w:t>i</w:t>
-      </w:r>
-      <w:proofErr w:type="spellEnd"/>
+        <w:t>learned linear projection matrix for values in head i</w:t>
+      </w:r>
     </w:p>
     <w:p>
       <w:pPr>
@@ -18098,21 +17568,7 @@
         <w:rPr>
           <w:szCs w:val="24"/>
         </w:rPr>
-        <w:t xml:space="preserve"> projects the queries, keys, and values of head </w:t>
-      </w:r>
-      <w:proofErr w:type="spellStart"/>
-      <w:r>
-        <w:rPr>
-          <w:szCs w:val="24"/>
-        </w:rPr>
-        <w:t>i</w:t>
-      </w:r>
-      <w:proofErr w:type="spellEnd"/>
-      <w:r>
-        <w:rPr>
-          <w:szCs w:val="24"/>
-        </w:rPr>
-        <w:t xml:space="preserve"> into specific low-dimensional subspaces. This enables each individual head to learn separate linguistic relationships (such as subject-verb agreement or coreference), enriching the model's contextual representations.</w:t>
+        <w:t xml:space="preserve"> projects the queries, keys, and values of head i into specific low-dimensional subspaces. This enables each individual head to learn separate linguistic relationships (such as subject-verb agreement or coreference), enriching the model's contextual representations.</w:t>
       </w:r>
     </w:p>
     <w:p>
@@ -18126,21 +17582,7 @@
         <w:rPr>
           <w:szCs w:val="24"/>
         </w:rPr>
-        <w:t xml:space="preserve">While BERT's bidirectional nature enables it to learn rich representations, fine-tuning its 110 million parameters is computationally expensive. </w:t>
-      </w:r>
-      <w:proofErr w:type="spellStart"/>
-      <w:r>
-        <w:rPr>
-          <w:szCs w:val="24"/>
-        </w:rPr>
-        <w:t>DistilBERT</w:t>
-      </w:r>
-      <w:proofErr w:type="spellEnd"/>
-      <w:r>
-        <w:rPr>
-          <w:szCs w:val="24"/>
-        </w:rPr>
-        <w:t xml:space="preserve"> addresses this by utilizing knowledge distillation during pre-training to compress the model. Knowledge distillation is a compression technique where a smaller 'student' network is trained to reproduce the behavior and output distribution of a larger 'teacher' network. The student model minimizes a multi-task loss function during training, which is formulated as follows:</w:t>
+        <w:t>While BERT's bidirectional nature enables it to learn rich representations, fine-tuning its 110 million parameters is computationally expensive. DistilBERT addresses this by utilizing knowledge distillation during pre-training to compress the model. Knowledge distillation is a compression technique where a smaller 'student' network is trained to reproduce the behavior and output distribution of a larger 'teacher' network. The student model minimizes a multi-task loss function during training, which is formulated as follows:</w:t>
       </w:r>
     </w:p>
     <w:p>
@@ -18456,7 +17898,6 @@
           <w:szCs w:val="24"/>
         </w:rPr>
       </w:pPr>
-      <w:proofErr w:type="spellStart"/>
       <w:r>
         <w:rPr>
           <w:b/>
@@ -18470,15 +17911,7 @@
           <w:b/>
           <w:szCs w:val="24"/>
         </w:rPr>
-        <w:t>total</w:t>
-      </w:r>
-      <w:proofErr w:type="spellEnd"/>
-      <w:r>
-        <w:rPr>
-          <w:b/>
-          <w:szCs w:val="24"/>
-        </w:rPr>
-        <w:t xml:space="preserve"> :</w:t>
+        <w:t>total :</w:t>
       </w:r>
       <w:proofErr w:type="gramEnd"/>
       <w:r>
@@ -18571,21 +18004,7 @@
         <w:rPr>
           <w:szCs w:val="24"/>
         </w:rPr>
-        <w:t>Kullback-</w:t>
-      </w:r>
-      <w:proofErr w:type="spellStart"/>
-      <w:r>
-        <w:rPr>
-          <w:szCs w:val="24"/>
-        </w:rPr>
-        <w:t>Leibler</w:t>
-      </w:r>
-      <w:proofErr w:type="spellEnd"/>
-      <w:r>
-        <w:rPr>
-          <w:szCs w:val="24"/>
-        </w:rPr>
-        <w:t xml:space="preserve"> divergence distillation loss</w:t>
+        <w:t>Kullback-Leibler divergence distillation loss</w:t>
       </w:r>
     </w:p>
     <w:p>
@@ -18597,7 +18016,6 @@
           <w:szCs w:val="24"/>
         </w:rPr>
       </w:pPr>
-      <w:proofErr w:type="spellStart"/>
       <w:r>
         <w:rPr>
           <w:b/>
@@ -18611,15 +18029,7 @@
           <w:b/>
           <w:szCs w:val="24"/>
         </w:rPr>
-        <w:t>cosine</w:t>
-      </w:r>
-      <w:proofErr w:type="spellEnd"/>
-      <w:r>
-        <w:rPr>
-          <w:b/>
-          <w:szCs w:val="24"/>
-        </w:rPr>
-        <w:t xml:space="preserve"> :</w:t>
+        <w:t>cosine :</w:t>
       </w:r>
       <w:proofErr w:type="gramEnd"/>
       <w:r>
@@ -19143,21 +18553,7 @@
         <w:rPr>
           <w:szCs w:val="24"/>
         </w:rPr>
-        <w:t>Kullback-</w:t>
-      </w:r>
-      <w:proofErr w:type="spellStart"/>
-      <w:r>
-        <w:rPr>
-          <w:szCs w:val="24"/>
-        </w:rPr>
-        <w:t>Leibler</w:t>
-      </w:r>
-      <w:proofErr w:type="spellEnd"/>
-      <w:r>
-        <w:rPr>
-          <w:szCs w:val="24"/>
-        </w:rPr>
-        <w:t xml:space="preserve"> divergence distillation loss</w:t>
+        <w:t>Kullback-Leibler divergence distillation loss</w:t>
       </w:r>
     </w:p>
     <w:p>
@@ -19233,21 +18629,7 @@
         <w:rPr>
           <w:szCs w:val="24"/>
         </w:rPr>
-        <w:t>Kullback-</w:t>
-      </w:r>
-      <w:proofErr w:type="spellStart"/>
-      <w:r>
-        <w:rPr>
-          <w:szCs w:val="24"/>
-        </w:rPr>
-        <w:t>Leibler</w:t>
-      </w:r>
-      <w:proofErr w:type="spellEnd"/>
-      <w:r>
-        <w:rPr>
-          <w:szCs w:val="24"/>
-        </w:rPr>
-        <w:t xml:space="preserve"> divergence operator that measures similarity between two distributions</w:t>
+        <w:t>Kullback-Leibler divergence operator that measures similarity between two distributions</w:t>
       </w:r>
     </w:p>
     <w:p>
@@ -19277,19 +18659,11 @@
         </w:rPr>
         <w:t xml:space="preserve"> </w:t>
       </w:r>
-      <w:proofErr w:type="spellStart"/>
-      <w:r>
-        <w:rPr>
-          <w:szCs w:val="24"/>
-        </w:rPr>
-        <w:t>softmax</w:t>
-      </w:r>
-      <w:proofErr w:type="spellEnd"/>
-      <w:r>
-        <w:rPr>
-          <w:szCs w:val="24"/>
-        </w:rPr>
-        <w:t xml:space="preserve"> function</w:t>
+      <w:r>
+        <w:rPr>
+          <w:szCs w:val="24"/>
+        </w:rPr>
+        <w:t>softmax function</w:t>
       </w:r>
     </w:p>
     <w:p>
@@ -19408,15 +18782,7 @@
         <w:jc w:val="both"/>
       </w:pPr>
       <w:r>
-        <w:t xml:space="preserve">The IMDB dataset is a standard benchmark for binary sentiment classification, consisting of 50,000 highly polarized movie reviews. For our experimental setup on Google </w:t>
-      </w:r>
-      <w:proofErr w:type="spellStart"/>
-      <w:r>
-        <w:t>Colab</w:t>
-      </w:r>
-      <w:proofErr w:type="spellEnd"/>
-      <w:r>
-        <w:t>, we partitioned the dataset into a training subset, a validation subset, and a test subset. Figure 3.1 displays the distribution of review lengths (word counts) and shows the balanced binary label distribution (50% positive and 50% negative reviews), ensuring the dataset is free from class imbalance bias.</w:t>
+        <w:t>The IMDB dataset is a standard benchmark for binary sentiment classification, consisting of 50,000 highly polarized movie reviews. For our experimental setup on Google Colab, we partitioned the dataset into a training subset, a validation subset, and a test subset. Figure 3.1 displays the distribution of review lengths (word counts) and shows the balanced binary label distribution (50% positive and 50% negative reviews), ensuring the dataset is free from class imbalance bias.</w:t>
       </w:r>
     </w:p>
     <w:p>
@@ -19443,7 +18809,7 @@
                     <pic:cNvPicPr/>
                   </pic:nvPicPr>
                   <pic:blipFill>
-                    <a:blip r:embed="rId12"/>
+                    <a:blip r:embed="rId11"/>
                     <a:stretch>
                       <a:fillRect/>
                     </a:stretch>
@@ -19576,15 +18942,7 @@
         <w:jc w:val="both"/>
       </w:pPr>
       <w:r>
-        <w:t xml:space="preserve">For this project, we utilize a subset of the IMDB dataset consisting of 8,000 training examples, 2,000 validation examples, and 2,000 test examples. This subset size was chosen deliberately to address Google </w:t>
-      </w:r>
-      <w:proofErr w:type="spellStart"/>
-      <w:r>
-        <w:t>Colab</w:t>
-      </w:r>
-      <w:proofErr w:type="spellEnd"/>
-      <w:r>
-        <w:t xml:space="preserve"> execution constraints and resource limitations. Conducting hyperparameter sweeps (across 3 learning rates and 3 batch sizes) for 5 distinct optimizers requires training and evaluating dozens of separate configurations. On a standard GPU session, training on the full 25,000-example training set would trigger CUDA out-of-memory errors or session disconnections due to time limits. A subset size of 8,000 examples provides a reliable balance between representation generalizability and training speed, enabling thorough and reproducible comparative benchmarking. While reducing the dataset size may limit absolute generalization accuracy compared to full-set training, it accentuates differences in optimizer stability and generalization, highlighting the role of regularization techniques like weight decay.</w:t>
+        <w:t>For this project, we utilize a subset of the IMDB dataset consisting of 8,000 training examples, 2,000 validation examples, and 2,000 test examples. This subset size was chosen deliberately to address Google Colab execution constraints and resource limitations. Conducting hyperparameter sweeps (across 3 learning rates and 3 batch sizes) for 5 distinct optimizers requires training and evaluating dozens of separate configurations. On a standard GPU session, training on the full 25,000-example training set would trigger CUDA out-of-memory errors or session disconnections due to time limits. A subset size of 8,000 examples provides a reliable balance between representation generalizability and training speed, enabling thorough and reproducible comparative benchmarking. While reducing the dataset size may limit absolute generalization accuracy compared to full-set training, it accentuates differences in optimizer stability and generalization, highlighting the role of regularization techniques like weight decay.</w:t>
       </w:r>
     </w:p>
     <w:p>
@@ -19991,95 +19349,7 @@
         <w:jc w:val="both"/>
       </w:pPr>
       <w:r>
-        <w:t xml:space="preserve">The text preprocessing pipeline begins with raw string extraction from the Hugging Face datasets interface. The reviews are processed using the pretrained </w:t>
-      </w:r>
-      <w:proofErr w:type="spellStart"/>
-      <w:r>
-        <w:t>distilbert</w:t>
-      </w:r>
-      <w:proofErr w:type="spellEnd"/>
-      <w:r>
-        <w:t xml:space="preserve">-base-uncased tokenizer. This tokenizer applies </w:t>
-      </w:r>
-      <w:proofErr w:type="spellStart"/>
-      <w:r>
-        <w:t>WordPiece</w:t>
-      </w:r>
-      <w:proofErr w:type="spellEnd"/>
-      <w:r>
-        <w:t xml:space="preserve"> </w:t>
-      </w:r>
-      <w:proofErr w:type="spellStart"/>
-      <w:r>
-        <w:t>subword</w:t>
-      </w:r>
-      <w:proofErr w:type="spellEnd"/>
-      <w:r>
-        <w:t xml:space="preserve"> tokenization, converting text sequences into numerical token IDs. The sequences are padded or truncated to a fixed limit of 256 tokens. The tokenizer outputs both </w:t>
-      </w:r>
-      <w:proofErr w:type="spellStart"/>
-      <w:r>
-        <w:t>input_ids</w:t>
-      </w:r>
-      <w:proofErr w:type="spellEnd"/>
-      <w:r>
-        <w:t xml:space="preserve"> (representing </w:t>
-      </w:r>
-      <w:proofErr w:type="spellStart"/>
-      <w:r>
-        <w:t>subword</w:t>
-      </w:r>
-      <w:proofErr w:type="spellEnd"/>
-      <w:r>
-        <w:t xml:space="preserve"> tokens) and </w:t>
-      </w:r>
-      <w:proofErr w:type="spellStart"/>
-      <w:r>
-        <w:t>attention_mask</w:t>
-      </w:r>
-      <w:proofErr w:type="spellEnd"/>
-      <w:r>
-        <w:t xml:space="preserve"> (notifying the self-attention heads which tokens are pads). To bypass serialization conflicts related to </w:t>
-      </w:r>
-      <w:proofErr w:type="spellStart"/>
-      <w:r>
-        <w:t>torchvision</w:t>
-      </w:r>
-      <w:proofErr w:type="spellEnd"/>
-      <w:r>
-        <w:t xml:space="preserve"> imports in Google </w:t>
-      </w:r>
-      <w:proofErr w:type="spellStart"/>
-      <w:r>
-        <w:t>Colab</w:t>
-      </w:r>
-      <w:proofErr w:type="spellEnd"/>
-      <w:r>
-        <w:t xml:space="preserve">, we wrapped the tokenizer outputs in a custom </w:t>
-      </w:r>
-      <w:proofErr w:type="spellStart"/>
-      <w:r>
-        <w:t>PyTorch</w:t>
-      </w:r>
-      <w:proofErr w:type="spellEnd"/>
-      <w:r>
-        <w:t xml:space="preserve"> Dataset class </w:t>
-      </w:r>
-      <w:proofErr w:type="spellStart"/>
-      <w:r>
-        <w:t>IMDBTorchDataset</w:t>
-      </w:r>
-      <w:proofErr w:type="spellEnd"/>
-      <w:r>
-        <w:t>. This class performs manual tensor conversions in its __</w:t>
-      </w:r>
-      <w:proofErr w:type="spellStart"/>
-      <w:r>
-        <w:t>getitem</w:t>
-      </w:r>
-      <w:proofErr w:type="spellEnd"/>
-      <w:r>
-        <w:t>__ method, ensuring stable and robust data loading.</w:t>
+        <w:t>The text preprocessing pipeline begins with raw string extraction from the Hugging Face datasets interface. The reviews are processed using the pretrained distilbert-base-uncased tokenizer. This tokenizer applies WordPiece subword tokenization, converting text sequences into numerical token IDs. The sequences are padded or truncated to a fixed limit of 256 tokens. The tokenizer outputs both input_ids (representing subword tokens) and attention_mask (notifying the self-attention heads which tokens are pads). To bypass serialization conflicts related to torchvision imports in Google Colab, we wrapped the tokenizer outputs in a custom PyTorch Dataset class IMDBTorchDataset. This class performs manual tensor conversions in its __getitem__ method, ensuring stable and robust data loading.</w:t>
       </w:r>
     </w:p>
     <w:p>
@@ -20097,55 +19367,7 @@
         <w:jc w:val="both"/>
       </w:pPr>
       <w:r>
-        <w:t xml:space="preserve">The model is instantiated using Hugging Face's </w:t>
-      </w:r>
-      <w:proofErr w:type="spellStart"/>
-      <w:r>
-        <w:t>AutoModelForSequenceClassification</w:t>
-      </w:r>
-      <w:proofErr w:type="spellEnd"/>
-      <w:r>
-        <w:t xml:space="preserve">, loading the pre-trained </w:t>
-      </w:r>
-      <w:proofErr w:type="spellStart"/>
-      <w:r>
-        <w:t>distilbert</w:t>
-      </w:r>
-      <w:proofErr w:type="spellEnd"/>
-      <w:r>
-        <w:t xml:space="preserve">-base-uncased checkpoint. The model is modified with a sequence classification head containing a linear projection layer mapping to the two target sentiment classes. To facilitate optimizer benchmarking, a centralized factory module was developed. The factory initializes standard </w:t>
-      </w:r>
-      <w:proofErr w:type="spellStart"/>
-      <w:r>
-        <w:t>PyTorch</w:t>
-      </w:r>
-      <w:proofErr w:type="spellEnd"/>
-      <w:r>
-        <w:t xml:space="preserve"> optimizers (SGD with Momentum, </w:t>
-      </w:r>
-      <w:proofErr w:type="spellStart"/>
-      <w:r>
-        <w:t>AdamW</w:t>
-      </w:r>
-      <w:proofErr w:type="spellEnd"/>
-      <w:r>
-        <w:t>), Hugging Face Transformers-specific configurations (</w:t>
-      </w:r>
-      <w:proofErr w:type="spellStart"/>
-      <w:r>
-        <w:t>AdaFactor</w:t>
-      </w:r>
-      <w:proofErr w:type="spellEnd"/>
-      <w:r>
-        <w:t xml:space="preserve">), and custom or </w:t>
-      </w:r>
-      <w:proofErr w:type="spellStart"/>
-      <w:r>
-        <w:t>pytorch</w:t>
-      </w:r>
-      <w:proofErr w:type="spellEnd"/>
-      <w:r>
-        <w:t>-optimizer fallbacks for LAMB and Lion. This setup ensures that all optimizers receive equivalent weight initialization and learning rate scheduling.</w:t>
+        <w:t>The model is instantiated using Hugging Face's AutoModelForSequenceClassification, loading the pre-trained distilbert-base-uncased checkpoint. The model is modified with a sequence classification head containing a linear projection layer mapping to the two target sentiment classes. To facilitate optimizer benchmarking, a centralized factory module was developed. The factory initializes standard PyTorch optimizers (SGD with Momentum, AdamW), Hugging Face Transformers-specific configurations (AdaFactor), and custom or pytorch-optimizer fallbacks for LAMB and Lion. This setup ensures that all optimizers receive equivalent weight initialization and learning rate scheduling.</w:t>
       </w:r>
     </w:p>
     <w:p>
@@ -20163,40 +19385,20 @@
         <w:jc w:val="both"/>
       </w:pPr>
       <w:r>
-        <w:t xml:space="preserve">The training sequence is driven by a custom </w:t>
-      </w:r>
-      <w:proofErr w:type="spellStart"/>
-      <w:r>
-        <w:t>PyTorch</w:t>
-      </w:r>
-      <w:proofErr w:type="spellEnd"/>
-      <w:r>
-        <w:t xml:space="preserve"> training loop. Training runs for a budget of 3 epochs. To reduce GPU memory usage and accelerate computation, mixed precision training is implemented using </w:t>
-      </w:r>
-      <w:proofErr w:type="spellStart"/>
-      <w:r>
-        <w:t>PyTorch's</w:t>
-      </w:r>
-      <w:proofErr w:type="spellEnd"/>
-      <w:r>
-        <w:t xml:space="preserve"> native Automatic Mixed Precision (AMP) API. The forward pass and loss calculations are executed under </w:t>
-      </w:r>
-      <w:proofErr w:type="spellStart"/>
+        <w:t xml:space="preserve">The training sequence is driven by a custom PyTorch training loop. Training runs for a budget of 3 epochs. To reduce GPU memory usage and accelerate computation, mixed precision training is implemented using PyTorch's native Automatic Mixed Precision (AMP) API. The forward pass and loss calculations are executed under </w:t>
+      </w:r>
       <w:proofErr w:type="gramStart"/>
       <w:r>
         <w:t>torch.cuda.amp.autocast</w:t>
       </w:r>
-      <w:proofErr w:type="spellEnd"/>
       <w:proofErr w:type="gramEnd"/>
       <w:r>
         <w:t xml:space="preserve">(), casting activations to FP16. The loss gradients are scaled using </w:t>
       </w:r>
-      <w:proofErr w:type="spellStart"/>
       <w:proofErr w:type="gramStart"/>
       <w:r>
         <w:t>torch.cuda.amp.GradScaler</w:t>
       </w:r>
-      <w:proofErr w:type="spellEnd"/>
       <w:proofErr w:type="gramEnd"/>
       <w:r>
         <w:t xml:space="preserve"> to prevent numerical underflow in FP16 gradients. The scaler manages backpropagation, scaling, and weight updating at each step.</w:t>
@@ -20263,7 +19465,7 @@
                     <pic:cNvPicPr/>
                   </pic:nvPicPr>
                   <pic:blipFill>
-                    <a:blip r:embed="rId13"/>
+                    <a:blip r:embed="rId12"/>
                     <a:stretch>
                       <a:fillRect/>
                     </a:stretch>
@@ -20394,33 +19596,7 @@
           <w:sz w:val="20"/>
           <w:szCs w:val="20"/>
         </w:rPr>
-        <w:t xml:space="preserve">:Global NLP architecture flowchart outlining preprocessing, tokenization, and </w:t>
-      </w:r>
-      <w:proofErr w:type="spellStart"/>
-      <w:r>
-        <w:rPr>
-          <w:b w:val="0"/>
-          <w:bCs w:val="0"/>
-          <w:i/>
-          <w:iCs/>
-          <w:color w:val="000000" w:themeColor="text1"/>
-          <w:sz w:val="20"/>
-          <w:szCs w:val="20"/>
-        </w:rPr>
-        <w:t>DistilBERT</w:t>
-      </w:r>
-      <w:proofErr w:type="spellEnd"/>
-      <w:r>
-        <w:rPr>
-          <w:b w:val="0"/>
-          <w:bCs w:val="0"/>
-          <w:i/>
-          <w:iCs/>
-          <w:color w:val="000000" w:themeColor="text1"/>
-          <w:sz w:val="20"/>
-          <w:szCs w:val="20"/>
-        </w:rPr>
-        <w:t xml:space="preserve"> execution.</w:t>
+        <w:t>:Global NLP architecture flowchart outlining preprocessing, tokenization, and DistilBERT execution.</w:t>
       </w:r>
       <w:bookmarkEnd w:id="37"/>
     </w:p>
@@ -20448,7 +19624,7 @@
                     <pic:cNvPicPr/>
                   </pic:nvPicPr>
                   <pic:blipFill>
-                    <a:blip r:embed="rId14"/>
+                    <a:blip r:embed="rId13"/>
                     <a:stretch>
                       <a:fillRect/>
                     </a:stretch>
@@ -20601,7 +19777,7 @@
                     <pic:cNvPicPr/>
                   </pic:nvPicPr>
                   <pic:blipFill>
-                    <a:blip r:embed="rId15"/>
+                    <a:blip r:embed="rId14"/>
                     <a:stretch>
                       <a:fillRect/>
                     </a:stretch>
@@ -21043,11 +20219,9 @@
             </w:tcMar>
           </w:tcPr>
           <w:p>
-            <w:proofErr w:type="spellStart"/>
             <w:r>
               <w:t>AdaFactor</w:t>
             </w:r>
-            <w:proofErr w:type="spellEnd"/>
           </w:p>
         </w:tc>
         <w:tc>
@@ -21247,11 +20421,9 @@
             </w:tcMar>
           </w:tcPr>
           <w:p>
-            <w:proofErr w:type="spellStart"/>
             <w:r>
               <w:t>AdamW</w:t>
             </w:r>
-            <w:proofErr w:type="spellEnd"/>
           </w:p>
         </w:tc>
         <w:tc>
@@ -22057,31 +21229,7 @@
         <w:jc w:val="both"/>
       </w:pPr>
       <w:r>
-        <w:t xml:space="preserve">We analyze the training and validation trajectories of the five optimizers across epochs. Figure 5.1 presents the loss curves, and Figure 5.2 displays the validation Accuracy and F1-score dynamics. </w:t>
-      </w:r>
-      <w:proofErr w:type="spellStart"/>
-      <w:r>
-        <w:t>AdaFactor</w:t>
-      </w:r>
-      <w:proofErr w:type="spellEnd"/>
-      <w:r>
-        <w:t xml:space="preserve"> and </w:t>
-      </w:r>
-      <w:proofErr w:type="spellStart"/>
-      <w:r>
-        <w:t>AdamW</w:t>
-      </w:r>
-      <w:proofErr w:type="spellEnd"/>
-      <w:r>
-        <w:t xml:space="preserve"> show a smooth and rapid convergence, with training loss decaying from ~0.60 to ~0.15 by Epoch 3. Their validation loss stabilizes around 0.35, indicating effective generalization. In contrast, SGD with Momentum remains stuck at a high validation loss (~0.69) throughout training. Lion achieves stable but slightly slower convergence compared to </w:t>
-      </w:r>
-      <w:proofErr w:type="spellStart"/>
-      <w:r>
-        <w:t>AdaFactor</w:t>
-      </w:r>
-      <w:proofErr w:type="spellEnd"/>
-      <w:r>
-        <w:t>, while LAMB exhibits sluggish convergence due to the conservative scaling of its trust ratio.</w:t>
+        <w:t>We analyze the training and validation trajectories of the five optimizers across epochs. Figure 5.1 presents the loss curves, and Figure 5.2 displays the validation Accuracy and F1-score dynamics. AdaFactor and AdamW show a smooth and rapid convergence, with training loss decaying from ~0.60 to ~0.15 by Epoch 3. Their validation loss stabilizes around 0.35, indicating effective generalization. In contrast, SGD with Momentum remains stuck at a high validation loss (~0.69) throughout training. Lion achieves stable but slightly slower convergence compared to AdaFactor, while LAMB exhibits sluggish convergence due to the conservative scaling of its trust ratio.</w:t>
       </w:r>
     </w:p>
     <w:p>
@@ -22089,23 +21237,7 @@
         <w:jc w:val="both"/>
       </w:pPr>
       <w:r>
-        <w:t xml:space="preserve">Figure 5.3 shows the global gradient norm trajectories, and Figure 5.4 displays the layer-wise gradient norms extracted at the third epoch. The gradient trajectories highlight the limitations of non-adaptive optimization: for SGD, the average gradient norm is low (~1.43) but shows highly skewed layer-wise distribution. In Figure 5.4, SGD's gradients in the early Embedding and Layer 0 layers are close to zero (vanishing gradients), while the classification head gradients are large. This prevents the lower layers from updating, causing the model to stall. Conversely, </w:t>
-      </w:r>
-      <w:proofErr w:type="spellStart"/>
-      <w:r>
-        <w:t>AdamW</w:t>
-      </w:r>
-      <w:proofErr w:type="spellEnd"/>
-      <w:r>
-        <w:t xml:space="preserve"> and </w:t>
-      </w:r>
-      <w:proofErr w:type="spellStart"/>
-      <w:r>
-        <w:t>AdaFactor</w:t>
-      </w:r>
-      <w:proofErr w:type="spellEnd"/>
-      <w:r>
-        <w:t xml:space="preserve"> maintain a balanced gradient distribution across all layers, facilitating backpropagation and effective parameter updating.</w:t>
+        <w:t>Figure 5.3 shows the global gradient norm trajectories, and Figure 5.4 displays the layer-wise gradient norms extracted at the third epoch. The gradient trajectories highlight the limitations of non-adaptive optimization: for SGD, the average gradient norm is low (~1.43) but shows highly skewed layer-wise distribution. In Figure 5.4, SGD's gradients in the early Embedding and Layer 0 layers are close to zero (vanishing gradients), while the classification head gradients are large. This prevents the lower layers from updating, causing the model to stall. Conversely, AdamW and AdaFactor maintain a balanced gradient distribution across all layers, facilitating backpropagation and effective parameter updating.</w:t>
       </w:r>
     </w:p>
     <w:p>
@@ -22114,31 +21246,7 @@
       </w:pPr>
       <w:r>
         <w:lastRenderedPageBreak/>
-        <w:t xml:space="preserve">Figure 5.5 presents a summary of the performance vs. resource trade-offs. It shows that </w:t>
-      </w:r>
-      <w:proofErr w:type="spellStart"/>
-      <w:r>
-        <w:t>AdaFactor</w:t>
-      </w:r>
-      <w:proofErr w:type="spellEnd"/>
-      <w:r>
-        <w:t xml:space="preserve"> matches </w:t>
-      </w:r>
-      <w:proofErr w:type="spellStart"/>
-      <w:r>
-        <w:t>AdamW's</w:t>
-      </w:r>
-      <w:proofErr w:type="spellEnd"/>
-      <w:r>
-        <w:t xml:space="preserve"> accuracy (~89.6%) while reducing GPU memory consumption by 30%. Figure 5.6 shows the confusion matrix for </w:t>
-      </w:r>
-      <w:proofErr w:type="spellStart"/>
-      <w:r>
-        <w:t>AdaFactor</w:t>
-      </w:r>
-      <w:proofErr w:type="spellEnd"/>
-      <w:r>
-        <w:t xml:space="preserve"> on the test set, showing balanced error rates between positive and negative reviews.</w:t>
+        <w:t>Figure 5.5 presents a summary of the performance vs. resource trade-offs. It shows that AdaFactor matches AdamW's accuracy (~89.6%) while reducing GPU memory consumption by 30%. Figure 5.6 shows the confusion matrix for AdaFactor on the test set, showing balanced error rates between positive and negative reviews.</w:t>
       </w:r>
     </w:p>
     <w:p/>
@@ -22166,7 +21274,7 @@
                     <pic:cNvPicPr/>
                   </pic:nvPicPr>
                   <pic:blipFill>
-                    <a:blip r:embed="rId16"/>
+                    <a:blip r:embed="rId15"/>
                     <a:stretch>
                       <a:fillRect/>
                     </a:stretch>
@@ -22297,7 +21405,7 @@
                     <pic:cNvPicPr/>
                   </pic:nvPicPr>
                   <pic:blipFill>
-                    <a:blip r:embed="rId17"/>
+                    <a:blip r:embed="rId16"/>
                     <a:stretch>
                       <a:fillRect/>
                     </a:stretch>
@@ -22445,7 +21553,7 @@
                     <pic:cNvPicPr/>
                   </pic:nvPicPr>
                   <pic:blipFill>
-                    <a:blip r:embed="rId18"/>
+                    <a:blip r:embed="rId17"/>
                     <a:stretch>
                       <a:fillRect/>
                     </a:stretch>
@@ -22577,7 +21685,7 @@
                     <pic:cNvPicPr/>
                   </pic:nvPicPr>
                   <pic:blipFill>
-                    <a:blip r:embed="rId19"/>
+                    <a:blip r:embed="rId18"/>
                     <a:stretch>
                       <a:fillRect/>
                     </a:stretch>
@@ -22725,7 +21833,7 @@
                     <pic:cNvPicPr/>
                   </pic:nvPicPr>
                   <pic:blipFill>
-                    <a:blip r:embed="rId20"/>
+                    <a:blip r:embed="rId19"/>
                     <a:stretch>
                       <a:fillRect/>
                     </a:stretch>
@@ -22871,7 +21979,7 @@
                     <pic:cNvPicPr/>
                   </pic:nvPicPr>
                   <pic:blipFill>
-                    <a:blip r:embed="rId21"/>
+                    <a:blip r:embed="rId20"/>
                     <a:stretch>
                       <a:fillRect/>
                     </a:stretch>
@@ -22990,33 +22098,7 @@
           <w:sz w:val="20"/>
           <w:szCs w:val="20"/>
         </w:rPr>
-        <w:t>:Confusion matrix on the IMDB test set for the recommended optimizer (</w:t>
-      </w:r>
-      <w:proofErr w:type="spellStart"/>
-      <w:r>
-        <w:rPr>
-          <w:b w:val="0"/>
-          <w:bCs w:val="0"/>
-          <w:i/>
-          <w:iCs/>
-          <w:color w:val="000000" w:themeColor="text1"/>
-          <w:sz w:val="20"/>
-          <w:szCs w:val="20"/>
-        </w:rPr>
-        <w:t>AdaFactor</w:t>
-      </w:r>
-      <w:proofErr w:type="spellEnd"/>
-      <w:r>
-        <w:rPr>
-          <w:b w:val="0"/>
-          <w:bCs w:val="0"/>
-          <w:i/>
-          <w:iCs/>
-          <w:color w:val="000000" w:themeColor="text1"/>
-          <w:sz w:val="20"/>
-          <w:szCs w:val="20"/>
-        </w:rPr>
-        <w:t>).</w:t>
+        <w:t>:Confusion matrix on the IMDB test set for the recommended optimizer (AdaFactor).</w:t>
       </w:r>
       <w:bookmarkEnd w:id="48"/>
     </w:p>
@@ -23962,7 +23044,6 @@
                 <w:szCs w:val="20"/>
               </w:rPr>
             </w:pPr>
-            <w:proofErr w:type="spellStart"/>
             <w:r>
               <w:rPr>
                 <w:sz w:val="20"/>
@@ -23970,7 +23051,6 @@
               </w:rPr>
               <w:t>AdamW</w:t>
             </w:r>
-            <w:proofErr w:type="spellEnd"/>
           </w:p>
         </w:tc>
         <w:tc>
@@ -24136,7 +23216,6 @@
                 <w:szCs w:val="20"/>
               </w:rPr>
             </w:pPr>
-            <w:proofErr w:type="spellStart"/>
             <w:r>
               <w:rPr>
                 <w:sz w:val="20"/>
@@ -24144,7 +23223,6 @@
               </w:rPr>
               <w:t>AdamW</w:t>
             </w:r>
-            <w:proofErr w:type="spellEnd"/>
           </w:p>
         </w:tc>
         <w:tc>
@@ -24310,7 +23388,6 @@
                 <w:szCs w:val="20"/>
               </w:rPr>
             </w:pPr>
-            <w:proofErr w:type="spellStart"/>
             <w:r>
               <w:rPr>
                 <w:sz w:val="20"/>
@@ -24318,7 +23395,6 @@
               </w:rPr>
               <w:t>AdamW</w:t>
             </w:r>
-            <w:proofErr w:type="spellEnd"/>
           </w:p>
         </w:tc>
         <w:tc>
@@ -24484,7 +23560,6 @@
                 <w:szCs w:val="20"/>
               </w:rPr>
             </w:pPr>
-            <w:proofErr w:type="spellStart"/>
             <w:r>
               <w:rPr>
                 <w:sz w:val="20"/>
@@ -24492,7 +23567,6 @@
               </w:rPr>
               <w:t>AdamW</w:t>
             </w:r>
-            <w:proofErr w:type="spellEnd"/>
           </w:p>
         </w:tc>
         <w:tc>
@@ -24658,7 +23732,6 @@
                 <w:szCs w:val="20"/>
               </w:rPr>
             </w:pPr>
-            <w:proofErr w:type="spellStart"/>
             <w:r>
               <w:rPr>
                 <w:sz w:val="20"/>
@@ -24666,7 +23739,6 @@
               </w:rPr>
               <w:t>AdaFactor</w:t>
             </w:r>
-            <w:proofErr w:type="spellEnd"/>
           </w:p>
         </w:tc>
         <w:tc>
@@ -24832,7 +23904,6 @@
                 <w:szCs w:val="20"/>
               </w:rPr>
             </w:pPr>
-            <w:proofErr w:type="spellStart"/>
             <w:r>
               <w:rPr>
                 <w:sz w:val="20"/>
@@ -24840,7 +23911,6 @@
               </w:rPr>
               <w:t>AdaFactor</w:t>
             </w:r>
-            <w:proofErr w:type="spellEnd"/>
           </w:p>
         </w:tc>
         <w:tc>
@@ -25006,7 +24076,6 @@
                 <w:szCs w:val="20"/>
               </w:rPr>
             </w:pPr>
-            <w:proofErr w:type="spellStart"/>
             <w:r>
               <w:rPr>
                 <w:sz w:val="20"/>
@@ -25014,7 +24083,6 @@
               </w:rPr>
               <w:t>AdaFactor</w:t>
             </w:r>
-            <w:proofErr w:type="spellEnd"/>
           </w:p>
         </w:tc>
         <w:tc>
@@ -25180,7 +24248,6 @@
                 <w:szCs w:val="20"/>
               </w:rPr>
             </w:pPr>
-            <w:proofErr w:type="spellStart"/>
             <w:r>
               <w:rPr>
                 <w:sz w:val="20"/>
@@ -25188,7 +24255,6 @@
               </w:rPr>
               <w:t>AdaFactor</w:t>
             </w:r>
-            <w:proofErr w:type="spellEnd"/>
           </w:p>
         </w:tc>
         <w:tc>
@@ -26735,7 +25801,7 @@
                     <pic:cNvPicPr/>
                   </pic:nvPicPr>
                   <pic:blipFill>
-                    <a:blip r:embed="rId22"/>
+                    <a:blip r:embed="rId21"/>
                     <a:stretch>
                       <a:fillRect/>
                     </a:stretch>
@@ -26882,7 +25948,7 @@
                     <pic:cNvPicPr/>
                   </pic:nvPicPr>
                   <pic:blipFill>
-                    <a:blip r:embed="rId23"/>
+                    <a:blip r:embed="rId22"/>
                     <a:stretch>
                       <a:fillRect/>
                     </a:stretch>
@@ -27825,14 +26891,12 @@
                 <w:sz w:val="22"/>
               </w:rPr>
             </w:pPr>
-            <w:proofErr w:type="spellStart"/>
             <w:r>
               <w:rPr>
                 <w:sz w:val="22"/>
               </w:rPr>
               <w:t>AdamW</w:t>
             </w:r>
-            <w:proofErr w:type="spellEnd"/>
           </w:p>
         </w:tc>
         <w:tc>
@@ -27957,14 +27021,12 @@
                 <w:sz w:val="22"/>
               </w:rPr>
             </w:pPr>
-            <w:proofErr w:type="spellStart"/>
             <w:r>
               <w:rPr>
                 <w:sz w:val="22"/>
               </w:rPr>
               <w:t>NaN</w:t>
             </w:r>
-            <w:proofErr w:type="spellEnd"/>
           </w:p>
         </w:tc>
         <w:tc>
@@ -28015,14 +27077,12 @@
                 <w:sz w:val="22"/>
               </w:rPr>
             </w:pPr>
-            <w:proofErr w:type="spellStart"/>
             <w:r>
               <w:rPr>
                 <w:sz w:val="22"/>
               </w:rPr>
               <w:t>AdamW</w:t>
             </w:r>
-            <w:proofErr w:type="spellEnd"/>
           </w:p>
         </w:tc>
         <w:tc>
@@ -28147,14 +27207,12 @@
                 <w:sz w:val="22"/>
               </w:rPr>
             </w:pPr>
-            <w:proofErr w:type="spellStart"/>
             <w:r>
               <w:rPr>
                 <w:sz w:val="22"/>
               </w:rPr>
               <w:t>NaN</w:t>
             </w:r>
-            <w:proofErr w:type="spellEnd"/>
           </w:p>
         </w:tc>
         <w:tc>
@@ -28205,14 +27263,12 @@
                 <w:sz w:val="22"/>
               </w:rPr>
             </w:pPr>
-            <w:proofErr w:type="spellStart"/>
             <w:r>
               <w:rPr>
                 <w:sz w:val="22"/>
               </w:rPr>
               <w:t>AdamW</w:t>
             </w:r>
-            <w:proofErr w:type="spellEnd"/>
           </w:p>
         </w:tc>
         <w:tc>
@@ -28337,14 +27393,12 @@
                 <w:sz w:val="22"/>
               </w:rPr>
             </w:pPr>
-            <w:proofErr w:type="spellStart"/>
             <w:r>
               <w:rPr>
                 <w:sz w:val="22"/>
               </w:rPr>
               <w:t>NaN</w:t>
             </w:r>
-            <w:proofErr w:type="spellEnd"/>
           </w:p>
         </w:tc>
         <w:tc>
@@ -28395,14 +27449,12 @@
                 <w:sz w:val="22"/>
               </w:rPr>
             </w:pPr>
-            <w:proofErr w:type="spellStart"/>
             <w:r>
               <w:rPr>
                 <w:sz w:val="22"/>
               </w:rPr>
               <w:t>AdaFactor</w:t>
             </w:r>
-            <w:proofErr w:type="spellEnd"/>
           </w:p>
         </w:tc>
         <w:tc>
@@ -28527,14 +27579,12 @@
                 <w:sz w:val="22"/>
               </w:rPr>
             </w:pPr>
-            <w:proofErr w:type="spellStart"/>
             <w:r>
               <w:rPr>
                 <w:sz w:val="22"/>
               </w:rPr>
               <w:t>NaN</w:t>
             </w:r>
-            <w:proofErr w:type="spellEnd"/>
           </w:p>
         </w:tc>
         <w:tc>
@@ -28585,14 +27635,12 @@
                 <w:sz w:val="22"/>
               </w:rPr>
             </w:pPr>
-            <w:proofErr w:type="spellStart"/>
             <w:r>
               <w:rPr>
                 <w:sz w:val="22"/>
               </w:rPr>
               <w:t>AdaFactor</w:t>
             </w:r>
-            <w:proofErr w:type="spellEnd"/>
           </w:p>
         </w:tc>
         <w:tc>
@@ -28717,14 +27765,12 @@
                 <w:sz w:val="22"/>
               </w:rPr>
             </w:pPr>
-            <w:proofErr w:type="spellStart"/>
             <w:r>
               <w:rPr>
                 <w:sz w:val="22"/>
               </w:rPr>
               <w:t>NaN</w:t>
             </w:r>
-            <w:proofErr w:type="spellEnd"/>
           </w:p>
         </w:tc>
         <w:tc>
@@ -28775,14 +27821,12 @@
                 <w:sz w:val="22"/>
               </w:rPr>
             </w:pPr>
-            <w:proofErr w:type="spellStart"/>
             <w:r>
               <w:rPr>
                 <w:sz w:val="22"/>
               </w:rPr>
               <w:t>AdaFactor</w:t>
             </w:r>
-            <w:proofErr w:type="spellEnd"/>
           </w:p>
         </w:tc>
         <w:tc>
@@ -28907,14 +27951,12 @@
                 <w:sz w:val="22"/>
               </w:rPr>
             </w:pPr>
-            <w:proofErr w:type="spellStart"/>
             <w:r>
               <w:rPr>
                 <w:sz w:val="22"/>
               </w:rPr>
               <w:t>NaN</w:t>
             </w:r>
-            <w:proofErr w:type="spellEnd"/>
           </w:p>
         </w:tc>
         <w:tc>
@@ -29653,14 +28695,12 @@
                 <w:sz w:val="22"/>
               </w:rPr>
             </w:pPr>
-            <w:proofErr w:type="spellStart"/>
             <w:r>
               <w:rPr>
                 <w:sz w:val="22"/>
               </w:rPr>
               <w:t>NaN</w:t>
             </w:r>
-            <w:proofErr w:type="spellEnd"/>
           </w:p>
         </w:tc>
         <w:tc>
@@ -29841,14 +28881,12 @@
                 <w:sz w:val="22"/>
               </w:rPr>
             </w:pPr>
-            <w:proofErr w:type="spellStart"/>
             <w:r>
               <w:rPr>
                 <w:sz w:val="22"/>
               </w:rPr>
               <w:t>NaN</w:t>
             </w:r>
-            <w:proofErr w:type="spellEnd"/>
           </w:p>
         </w:tc>
         <w:tc>
@@ -30029,14 +29067,12 @@
                 <w:sz w:val="22"/>
               </w:rPr>
             </w:pPr>
-            <w:proofErr w:type="spellStart"/>
             <w:r>
               <w:rPr>
                 <w:sz w:val="22"/>
               </w:rPr>
               <w:t>NaN</w:t>
             </w:r>
-            <w:proofErr w:type="spellEnd"/>
           </w:p>
         </w:tc>
         <w:tc>
@@ -30092,82 +29128,16 @@
       <w:bookmarkStart w:id="53" w:name="_Toc232863560"/>
       <w:r>
         <w:lastRenderedPageBreak/>
-        <w:t xml:space="preserve">6.1 Why </w:t>
-      </w:r>
-      <w:proofErr w:type="spellStart"/>
-      <w:r>
-        <w:t>AdaFactor</w:t>
-      </w:r>
-      <w:proofErr w:type="spellEnd"/>
-      <w:r>
-        <w:t xml:space="preserve"> Achieves Top Performance and Comparison with </w:t>
-      </w:r>
-      <w:proofErr w:type="spellStart"/>
-      <w:r>
-        <w:t>AdamW</w:t>
+        <w:t>6.1 Why AdaFactor Achieves Top Performance and Comparison with AdamW</w:t>
       </w:r>
       <w:bookmarkEnd w:id="53"/>
-      <w:proofErr w:type="spellEnd"/>
     </w:p>
     <w:p>
       <w:pPr>
         <w:jc w:val="both"/>
       </w:pPr>
-      <w:proofErr w:type="spellStart"/>
-      <w:r>
-        <w:t>AdaFactor</w:t>
-      </w:r>
-      <w:proofErr w:type="spellEnd"/>
-      <w:r>
-        <w:t xml:space="preserve"> achieves the top rank in the benchmark, securing an F1-score of 89.72% on the test set while using only 1204.3 MB of GPU memory (29.7% lower than </w:t>
-      </w:r>
-      <w:proofErr w:type="spellStart"/>
-      <w:r>
-        <w:t>AdamW's</w:t>
-      </w:r>
-      <w:proofErr w:type="spellEnd"/>
-      <w:r>
-        <w:t xml:space="preserve"> 1724.5 MB). This efficiency is due to its factored second-moment tracking. Instead of storing a full </w:t>
-      </w:r>
-      <w:proofErr w:type="spellStart"/>
-      <w:r>
-        <w:t>d_in</w:t>
-      </w:r>
-      <w:proofErr w:type="spellEnd"/>
-      <w:r>
-        <w:t xml:space="preserve"> x </w:t>
-      </w:r>
-      <w:proofErr w:type="spellStart"/>
-      <w:r>
-        <w:t>d_out</w:t>
-      </w:r>
-      <w:proofErr w:type="spellEnd"/>
-      <w:r>
-        <w:t xml:space="preserve"> matrix, it tracks row and column projections. The slight accuracy edge of </w:t>
-      </w:r>
-      <w:proofErr w:type="spellStart"/>
-      <w:r>
-        <w:t>AdaFactor</w:t>
-      </w:r>
-      <w:proofErr w:type="spellEnd"/>
-      <w:r>
-        <w:t xml:space="preserve"> over </w:t>
-      </w:r>
-      <w:proofErr w:type="spellStart"/>
-      <w:r>
-        <w:t>AdamW</w:t>
-      </w:r>
-      <w:proofErr w:type="spellEnd"/>
-      <w:r>
-        <w:t xml:space="preserve"> suggests that omitting momentum and utilizing its scale-invariant updates acted as a </w:t>
-      </w:r>
-      <w:proofErr w:type="spellStart"/>
-      <w:r>
-        <w:t>regularizer</w:t>
-      </w:r>
-      <w:proofErr w:type="spellEnd"/>
-      <w:r>
-        <w:t>, preventing overfitting on the 8,000-sample training set.</w:t>
+      <w:r>
+        <w:t>AdaFactor achieves the top rank in the benchmark, securing an F1-score of 89.72% on the test set while using only 1204.3 MB of GPU memory (29.7% lower than AdamW's 1724.5 MB). This efficiency is due to its factored second-moment tracking. Instead of storing a full d_in x d_out matrix, it tracks row and column projections. The slight accuracy edge of AdaFactor over AdamW suggests that omitting momentum and utilizing its scale-invariant updates acted as a regularizer, preventing overfitting on the 8,000-sample training set.</w:t>
       </w:r>
     </w:p>
     <w:p>
@@ -30290,7 +29260,6 @@
             </w:tcMar>
           </w:tcPr>
           <w:p>
-            <w:proofErr w:type="spellStart"/>
             <w:r>
               <w:rPr>
                 <w:b/>
@@ -30298,7 +29267,6 @@
               </w:rPr>
               <w:t>AdamW</w:t>
             </w:r>
-            <w:proofErr w:type="spellEnd"/>
           </w:p>
         </w:tc>
         <w:tc>
@@ -30313,7 +29281,6 @@
             </w:tcMar>
           </w:tcPr>
           <w:p>
-            <w:proofErr w:type="spellStart"/>
             <w:r>
               <w:rPr>
                 <w:b/>
@@ -30321,7 +29288,6 @@
               </w:rPr>
               <w:t>AdaFactor</w:t>
             </w:r>
-            <w:proofErr w:type="spellEnd"/>
           </w:p>
         </w:tc>
         <w:tc>
@@ -31263,23 +30229,7 @@
         <w:jc w:val="both"/>
       </w:pPr>
       <w:r>
-        <w:t xml:space="preserve">Internal validity concerns whether the observed differences are caused by the optimizers. We standardized the seed, dataset splits, and hyperparameters. However, using the same learning rate (2e-5) may favor </w:t>
-      </w:r>
-      <w:proofErr w:type="spellStart"/>
-      <w:r>
-        <w:t>AdamW</w:t>
-      </w:r>
-      <w:proofErr w:type="spellEnd"/>
-      <w:r>
-        <w:t xml:space="preserve"> and </w:t>
-      </w:r>
-      <w:proofErr w:type="spellStart"/>
-      <w:r>
-        <w:t>AdaFactor</w:t>
-      </w:r>
-      <w:proofErr w:type="spellEnd"/>
-      <w:r>
-        <w:t>, as it was tuned for them, while SGD and Lion might benefit from separate learning rate tuning.</w:t>
+        <w:t>Internal validity concerns whether the observed differences are caused by the optimizers. We standardized the seed, dataset splits, and hyperparameters. However, using the same learning rate (2e-5) may favor AdamW and AdaFactor, as it was tuned for them, while SGD and Lion might benefit from separate learning rate tuning.</w:t>
       </w:r>
     </w:p>
     <w:p>
@@ -31297,23 +30247,7 @@
         <w:jc w:val="both"/>
       </w:pPr>
       <w:r>
-        <w:t xml:space="preserve">External validity relates to the generalizability of our findings. The experiments were restricted to </w:t>
-      </w:r>
-      <w:proofErr w:type="spellStart"/>
-      <w:r>
-        <w:t>DistilBERT</w:t>
-      </w:r>
-      <w:proofErr w:type="spellEnd"/>
-      <w:r>
-        <w:t xml:space="preserve"> and a subset of the IMDB dataset (8,000 samples). Results might differ for larger architectures (e.g., </w:t>
-      </w:r>
-      <w:proofErr w:type="spellStart"/>
-      <w:r>
-        <w:t>DeBERTa</w:t>
-      </w:r>
-      <w:proofErr w:type="spellEnd"/>
-      <w:r>
-        <w:t>) or larger dataset sizes.</w:t>
+        <w:t>External validity relates to the generalizability of our findings. The experiments were restricted to DistilBERT and a subset of the IMDB dataset (8,000 samples). Results might differ for larger architectures (e.g., DeBERTa) or larger dataset sizes.</w:t>
       </w:r>
     </w:p>
     <w:p>
@@ -31331,15 +30265,7 @@
         <w:jc w:val="both"/>
       </w:pPr>
       <w:r>
-        <w:t xml:space="preserve">The main statistical threat is the lack of multiple runs with different seeds, preventing the calculation of standard deviations. Construct validity is supported by using </w:t>
-      </w:r>
-      <w:proofErr w:type="spellStart"/>
-      <w:r>
-        <w:t>PyTorch's</w:t>
-      </w:r>
-      <w:proofErr w:type="spellEnd"/>
-      <w:r>
-        <w:t xml:space="preserve"> native memory tracking, which captures tensor memory but does not include CUDA cache overhead.</w:t>
+        <w:t>The main statistical threat is the lack of multiple runs with different seeds, preventing the calculation of standard deviations. Construct validity is supported by using PyTorch's native memory tracking, which captures tensor memory but does not include CUDA cache overhead.</w:t>
       </w:r>
     </w:p>
     <w:p>
@@ -31357,47 +30283,7 @@
         <w:jc w:val="both"/>
       </w:pPr>
       <w:r>
-        <w:t xml:space="preserve">To address the limitations, future work should evaluate the optimizers on alternative architectures. We recommend validating the top-performing optimizer on the </w:t>
-      </w:r>
-      <w:proofErr w:type="spellStart"/>
-      <w:r>
-        <w:t>MiniLM</w:t>
-      </w:r>
-      <w:proofErr w:type="spellEnd"/>
-      <w:r>
-        <w:t xml:space="preserve"> model (</w:t>
-      </w:r>
-      <w:proofErr w:type="spellStart"/>
-      <w:r>
-        <w:t>microsoft</w:t>
-      </w:r>
-      <w:proofErr w:type="spellEnd"/>
-      <w:r>
-        <w:t xml:space="preserve">/MiniLM-L12-H384-uncased). </w:t>
-      </w:r>
-      <w:proofErr w:type="spellStart"/>
-      <w:r>
-        <w:t>MiniLM</w:t>
-      </w:r>
-      <w:proofErr w:type="spellEnd"/>
-      <w:r>
-        <w:t xml:space="preserve"> contains 12 layers (vs. 6 in </w:t>
-      </w:r>
-      <w:proofErr w:type="spellStart"/>
-      <w:r>
-        <w:t>DistilBERT</w:t>
-      </w:r>
-      <w:proofErr w:type="spellEnd"/>
-      <w:r>
-        <w:t xml:space="preserve">) but has a narrower dimension (384 vs. 768), resulting in ~33 million parameters. This setup would verify if the memory savings of </w:t>
-      </w:r>
-      <w:proofErr w:type="spellStart"/>
-      <w:r>
-        <w:t>AdaFactor</w:t>
-      </w:r>
-      <w:proofErr w:type="spellEnd"/>
-      <w:r>
-        <w:t xml:space="preserve"> and the speed of Lion translate to deeper, narrower networks.</w:t>
+        <w:t>To address the limitations, future work should evaluate the optimizers on alternative architectures. We recommend validating the top-performing optimizer on the MiniLM model (microsoft/MiniLM-L12-H384-uncased). MiniLM contains 12 layers (vs. 6 in DistilBERT) but has a narrower dimension (384 vs. 768), resulting in ~33 million parameters. This setup would verify if the memory savings of AdaFactor and the speed of Lion translate to deeper, narrower networks.</w:t>
       </w:r>
     </w:p>
     <w:p>
@@ -31415,31 +30301,7 @@
         <w:jc w:val="both"/>
       </w:pPr>
       <w:r>
-        <w:t xml:space="preserve">This study compared SGD with Momentum, </w:t>
-      </w:r>
-      <w:proofErr w:type="spellStart"/>
-      <w:r>
-        <w:t>AdamW</w:t>
-      </w:r>
-      <w:proofErr w:type="spellEnd"/>
-      <w:r>
-        <w:t xml:space="preserve">, </w:t>
-      </w:r>
-      <w:proofErr w:type="spellStart"/>
-      <w:r>
-        <w:t>AdaFactor</w:t>
-      </w:r>
-      <w:proofErr w:type="spellEnd"/>
-      <w:r>
-        <w:t xml:space="preserve">, LAMB, and Lion for fine-tuning </w:t>
-      </w:r>
-      <w:proofErr w:type="spellStart"/>
-      <w:r>
-        <w:t>DistilBERT</w:t>
-      </w:r>
-      <w:proofErr w:type="spellEnd"/>
-      <w:r>
-        <w:t xml:space="preserve"> on IMDB sentiment classification. The empirical results show the clear necessity of adaptive learning rates.</w:t>
+        <w:t>This study compared SGD with Momentum, AdamW, AdaFactor, LAMB, and Lion for fine-tuning DistilBERT on IMDB sentiment classification. The empirical results show the clear necessity of adaptive learning rates.</w:t>
       </w:r>
     </w:p>
     <w:p>
@@ -31447,23 +30309,7 @@
         <w:jc w:val="both"/>
       </w:pPr>
       <w:r>
-        <w:t xml:space="preserve">Based on accuracy and resource efficiency, </w:t>
-      </w:r>
-      <w:proofErr w:type="spellStart"/>
-      <w:r>
-        <w:t>AdaFactor</w:t>
-      </w:r>
-      <w:proofErr w:type="spellEnd"/>
-      <w:r>
-        <w:t xml:space="preserve"> is the recommended optimizer. It achieves a top F1-score of 89.72% while reducing GPU memory usage by 30% compared to </w:t>
-      </w:r>
-      <w:proofErr w:type="spellStart"/>
-      <w:r>
-        <w:t>AdamW</w:t>
-      </w:r>
-      <w:proofErr w:type="spellEnd"/>
-      <w:r>
-        <w:t>, making it highly suitable for resource-constrained training. Lion is a strong alternative for maximizing training speed, provided that the learning rate is carefully tuned.</w:t>
+        <w:t>Based on accuracy and resource efficiency, AdaFactor is the recommended optimizer. It achieves a top F1-score of 89.72% while reducing GPU memory usage by 30% compared to AdamW, making it highly suitable for resource-constrained training. Lion is a strong alternative for maximizing training speed, provided that the learning rate is carefully tuned.</w:t>
       </w:r>
     </w:p>
     <w:p>
@@ -31501,15 +30347,7 @@
         <w:t xml:space="preserve">Chen, J., Liang, C., Huang, D., et al. </w:t>
       </w:r>
       <w:r>
-        <w:t xml:space="preserve">(2023). Lion: Evolved Sign Momentum. </w:t>
-      </w:r>
-      <w:proofErr w:type="spellStart"/>
-      <w:r>
-        <w:t>arXiv</w:t>
-      </w:r>
-      <w:proofErr w:type="spellEnd"/>
-      <w:r>
-        <w:t xml:space="preserve"> preprint arXiv:2302.06675.</w:t>
+        <w:t>(2023). Lion: Evolved Sign Momentum. arXiv preprint arXiv:2302.06675.</w:t>
       </w:r>
     </w:p>
     <w:p>
@@ -31522,32 +30360,10 @@
         <w:rPr>
           <w:lang w:val="fr-FR"/>
         </w:rPr>
-        <w:t xml:space="preserve">Devlin, J., Chang, M. W., Lee, K., &amp; </w:t>
-      </w:r>
-      <w:proofErr w:type="spellStart"/>
-      <w:r>
-        <w:rPr>
-          <w:lang w:val="fr-FR"/>
-        </w:rPr>
-        <w:t>Toutanova</w:t>
-      </w:r>
-      <w:proofErr w:type="spellEnd"/>
-      <w:r>
-        <w:rPr>
-          <w:lang w:val="fr-FR"/>
-        </w:rPr>
-        <w:t xml:space="preserve">, K. (2018). </w:t>
-      </w:r>
-      <w:r>
-        <w:t xml:space="preserve">BERT: Pre-training of Deep Bidirectional Transformers for Language Understanding. </w:t>
-      </w:r>
-      <w:proofErr w:type="spellStart"/>
-      <w:r>
-        <w:t>arXiv</w:t>
-      </w:r>
-      <w:proofErr w:type="spellEnd"/>
-      <w:r>
-        <w:t xml:space="preserve"> preprint arXiv:1810.04805.</w:t>
+        <w:t xml:space="preserve">Devlin, J., Chang, M. W., Lee, K., &amp; Toutanova, K. (2018). </w:t>
+      </w:r>
+      <w:r>
+        <w:t>BERT: Pre-training of Deep Bidirectional Transformers for Language Understanding. arXiv preprint arXiv:1810.04805.</w:t>
       </w:r>
     </w:p>
     <w:p>
@@ -31557,15 +30373,7 @@
         <w:jc w:val="both"/>
       </w:pPr>
       <w:r>
-        <w:t xml:space="preserve">Kingma, D. P., &amp; Ba, J. (2014). Adam: A Method for Stochastic Optimization. </w:t>
-      </w:r>
-      <w:proofErr w:type="spellStart"/>
-      <w:r>
-        <w:t>arXiv</w:t>
-      </w:r>
-      <w:proofErr w:type="spellEnd"/>
-      <w:r>
-        <w:t xml:space="preserve"> preprint arXiv:1412.6980.</w:t>
+        <w:t>Kingma, D. P., &amp; Ba, J. (2014). Adam: A Method for Stochastic Optimization. arXiv preprint arXiv:1412.6980.</w:t>
       </w:r>
     </w:p>
     <w:p>
@@ -31575,15 +30383,7 @@
         <w:jc w:val="both"/>
       </w:pPr>
       <w:r>
-        <w:t xml:space="preserve">Loshchilov, I., &amp; Hutter, F. (2017). Decoupled Weight Decay Regularization. </w:t>
-      </w:r>
-      <w:proofErr w:type="spellStart"/>
-      <w:r>
-        <w:t>arXiv</w:t>
-      </w:r>
-      <w:proofErr w:type="spellEnd"/>
-      <w:r>
-        <w:t xml:space="preserve"> preprint arXiv:1711.05101.</w:t>
+        <w:t>Loshchilov, I., &amp; Hutter, F. (2017). Decoupled Weight Decay Regularization. arXiv preprint arXiv:1711.05101.</w:t>
       </w:r>
     </w:p>
     <w:p>
@@ -31593,31 +30393,7 @@
         <w:jc w:val="both"/>
       </w:pPr>
       <w:r>
-        <w:t xml:space="preserve">Sanh, V., Debut, L., </w:t>
-      </w:r>
-      <w:proofErr w:type="spellStart"/>
-      <w:r>
-        <w:t>Chaumond</w:t>
-      </w:r>
-      <w:proofErr w:type="spellEnd"/>
-      <w:r>
-        <w:t xml:space="preserve">, J., &amp; Wolf, T. (2019). </w:t>
-      </w:r>
-      <w:proofErr w:type="spellStart"/>
-      <w:r>
-        <w:t>DistilBERT</w:t>
-      </w:r>
-      <w:proofErr w:type="spellEnd"/>
-      <w:r>
-        <w:t xml:space="preserve">, a distilled version of BERT: smaller, faster, cheaper and lighter. </w:t>
-      </w:r>
-      <w:proofErr w:type="spellStart"/>
-      <w:r>
-        <w:t>arXiv</w:t>
-      </w:r>
-      <w:proofErr w:type="spellEnd"/>
-      <w:r>
-        <w:t xml:space="preserve"> preprint arXiv:1910.01108.</w:t>
+        <w:t>Sanh, V., Debut, L., Chaumond, J., &amp; Wolf, T. (2019). DistilBERT, a distilled version of BERT: smaller, faster, cheaper and lighter. arXiv preprint arXiv:1910.01108.</w:t>
       </w:r>
     </w:p>
     <w:p>
@@ -31626,29 +30402,8 @@
         <w:ind w:left="360" w:hanging="360"/>
         <w:jc w:val="both"/>
       </w:pPr>
-      <w:proofErr w:type="spellStart"/>
-      <w:r>
-        <w:t>Shazeer</w:t>
-      </w:r>
-      <w:proofErr w:type="spellEnd"/>
-      <w:r>
-        <w:t xml:space="preserve">, N., &amp; Stern, M. (2018). </w:t>
-      </w:r>
-      <w:proofErr w:type="spellStart"/>
-      <w:r>
-        <w:t>Adafactor</w:t>
-      </w:r>
-      <w:proofErr w:type="spellEnd"/>
-      <w:r>
-        <w:t xml:space="preserve">: Adaptive Learning Rates with Sublinear Memory Cost. </w:t>
-      </w:r>
-      <w:proofErr w:type="spellStart"/>
-      <w:r>
-        <w:t>arXiv</w:t>
-      </w:r>
-      <w:proofErr w:type="spellEnd"/>
-      <w:r>
-        <w:t xml:space="preserve"> preprint arXiv:1804.04235.</w:t>
+      <w:r>
+        <w:t>Shazeer, N., &amp; Stern, M. (2018). Adafactor: Adaptive Learning Rates with Sublinear Memory Cost. arXiv preprint arXiv:1804.04235.</w:t>
       </w:r>
     </w:p>
     <w:p>
@@ -31661,21 +30416,7 @@
         <w:rPr>
           <w:lang w:val="fr-FR"/>
         </w:rPr>
-        <w:t xml:space="preserve">Vaswani, A., </w:t>
-      </w:r>
-      <w:proofErr w:type="spellStart"/>
-      <w:r>
-        <w:rPr>
-          <w:lang w:val="fr-FR"/>
-        </w:rPr>
-        <w:t>Shazeer</w:t>
-      </w:r>
-      <w:proofErr w:type="spellEnd"/>
-      <w:r>
-        <w:rPr>
-          <w:lang w:val="fr-FR"/>
-        </w:rPr>
-        <w:t xml:space="preserve">, N., Parmar, N., et al. </w:t>
+        <w:t xml:space="preserve">Vaswani, A., Shazeer, N., Parmar, N., et al. </w:t>
       </w:r>
       <w:r>
         <w:t>(2017). Attention is All You Need. Advances in Neural Information Processing Systems, 30.</w:t>
@@ -31688,15 +30429,7 @@
         <w:jc w:val="both"/>
       </w:pPr>
       <w:r>
-        <w:t xml:space="preserve">You, Y., Li, J., Reddi, S., et al. (2019). Large Batch Optimization for Deep Learning: Training BERT in 76 minutes. </w:t>
-      </w:r>
-      <w:proofErr w:type="spellStart"/>
-      <w:r>
-        <w:t>arXiv</w:t>
-      </w:r>
-      <w:proofErr w:type="spellEnd"/>
-      <w:r>
-        <w:t xml:space="preserve"> preprint arXiv:1904.00962.</w:t>
+        <w:t>You, Y., Li, J., Reddi, S., et al. (2019). Large Batch Optimization for Deep Learning: Training BERT in 76 minutes. arXiv preprint arXiv:1904.00962.</w:t>
       </w:r>
     </w:p>
     <w:p>
@@ -31707,9 +30440,6 @@
         </w:rPr>
       </w:pPr>
       <w:bookmarkStart w:id="62" w:name="_Toc232785440"/>
-      <w:r>
-        <w:t xml:space="preserve"> </w:t>
-      </w:r>
       <w:bookmarkStart w:id="63" w:name="_Toc232863569"/>
       <w:r>
         <w:rPr>
@@ -31811,14 +30541,12 @@
       <w:r>
         <w:t xml:space="preserve">The experimental results, convergence metrics, and figures were generated using the notebook </w:t>
       </w:r>
-      <w:proofErr w:type="spellStart"/>
       <w:r>
         <w:rPr>
           <w:b/>
         </w:rPr>
         <w:t>Study_of_Adaptive_Gradient_Methods_in_NLP.ipynb</w:t>
       </w:r>
-      <w:proofErr w:type="spellEnd"/>
       <w:r>
         <w:t>. The notebook contains the full experimental setup, including dataset splitting, multi-optimizer benchmarking, metric logging, and visualization script executions, supporting the reproducibility of the study.</w:t>
       </w:r>
@@ -31883,39 +30611,21 @@
       <w:r>
         <w:t xml:space="preserve"> library using the dataset name </w:t>
       </w:r>
-      <w:proofErr w:type="spellStart"/>
       <w:r>
         <w:rPr>
           <w:b/>
           <w:bCs/>
         </w:rPr>
-        <w:t>stanfordnlp</w:t>
-      </w:r>
-      <w:proofErr w:type="spellEnd"/>
-      <w:r>
-        <w:rPr>
-          <w:b/>
-          <w:bCs/>
-        </w:rPr>
-        <w:t>/</w:t>
-      </w:r>
-      <w:proofErr w:type="spellStart"/>
-      <w:r>
-        <w:rPr>
-          <w:b/>
-          <w:bCs/>
-        </w:rPr>
-        <w:t>imdb</w:t>
-      </w:r>
-      <w:proofErr w:type="spellEnd"/>
+        <w:t>stanfordnlp/imdb</w:t>
+      </w:r>
       <w:r>
         <w:t>.</w:t>
       </w:r>
     </w:p>
     <w:p/>
     <w:sectPr>
-      <w:headerReference w:type="default" r:id="rId24"/>
-      <w:footerReference w:type="default" r:id="rId25"/>
+      <w:headerReference w:type="default" r:id="rId23"/>
+      <w:footerReference w:type="default" r:id="rId24"/>
       <w:pgSz w:w="11906" w:h="16838"/>
       <w:pgMar w:top="1417" w:right="1417" w:bottom="1417" w:left="1417" w:header="720" w:footer="720" w:gutter="0"/>
       <w:cols w:space="720"/>
@@ -32620,6 +31330,345 @@
       </w:rPr>
     </w:lvl>
   </w:abstractNum>
+  <w:abstractNum w:abstractNumId="11" w15:restartNumberingAfterBreak="0">
+    <w:nsid w:val="188E2618"/>
+    <w:multiLevelType w:val="hybridMultilevel"/>
+    <w:tmpl w:val="1D328F12"/>
+    <w:lvl w:ilvl="0" w:tplc="040C0001">
+      <w:start w:val="1"/>
+      <w:numFmt w:val="bullet"/>
+      <w:lvlText w:val=""/>
+      <w:lvlJc w:val="left"/>
+      <w:pPr>
+        <w:ind w:left="720" w:hanging="360"/>
+      </w:pPr>
+      <w:rPr>
+        <w:rFonts w:ascii="Symbol" w:hAnsi="Symbol" w:hint="default"/>
+      </w:rPr>
+    </w:lvl>
+    <w:lvl w:ilvl="1" w:tplc="040C0003" w:tentative="1">
+      <w:start w:val="1"/>
+      <w:numFmt w:val="bullet"/>
+      <w:lvlText w:val="o"/>
+      <w:lvlJc w:val="left"/>
+      <w:pPr>
+        <w:ind w:left="1440" w:hanging="360"/>
+      </w:pPr>
+      <w:rPr>
+        <w:rFonts w:ascii="Courier New" w:hAnsi="Courier New" w:cs="Courier New" w:hint="default"/>
+      </w:rPr>
+    </w:lvl>
+    <w:lvl w:ilvl="2" w:tplc="040C0005" w:tentative="1">
+      <w:start w:val="1"/>
+      <w:numFmt w:val="bullet"/>
+      <w:lvlText w:val=""/>
+      <w:lvlJc w:val="left"/>
+      <w:pPr>
+        <w:ind w:left="2160" w:hanging="360"/>
+      </w:pPr>
+      <w:rPr>
+        <w:rFonts w:ascii="Wingdings" w:hAnsi="Wingdings" w:hint="default"/>
+      </w:rPr>
+    </w:lvl>
+    <w:lvl w:ilvl="3" w:tplc="040C0001" w:tentative="1">
+      <w:start w:val="1"/>
+      <w:numFmt w:val="bullet"/>
+      <w:lvlText w:val=""/>
+      <w:lvlJc w:val="left"/>
+      <w:pPr>
+        <w:ind w:left="2880" w:hanging="360"/>
+      </w:pPr>
+      <w:rPr>
+        <w:rFonts w:ascii="Symbol" w:hAnsi="Symbol" w:hint="default"/>
+      </w:rPr>
+    </w:lvl>
+    <w:lvl w:ilvl="4" w:tplc="040C0003" w:tentative="1">
+      <w:start w:val="1"/>
+      <w:numFmt w:val="bullet"/>
+      <w:lvlText w:val="o"/>
+      <w:lvlJc w:val="left"/>
+      <w:pPr>
+        <w:ind w:left="3600" w:hanging="360"/>
+      </w:pPr>
+      <w:rPr>
+        <w:rFonts w:ascii="Courier New" w:hAnsi="Courier New" w:cs="Courier New" w:hint="default"/>
+      </w:rPr>
+    </w:lvl>
+    <w:lvl w:ilvl="5" w:tplc="040C0005" w:tentative="1">
+      <w:start w:val="1"/>
+      <w:numFmt w:val="bullet"/>
+      <w:lvlText w:val=""/>
+      <w:lvlJc w:val="left"/>
+      <w:pPr>
+        <w:ind w:left="4320" w:hanging="360"/>
+      </w:pPr>
+      <w:rPr>
+        <w:rFonts w:ascii="Wingdings" w:hAnsi="Wingdings" w:hint="default"/>
+      </w:rPr>
+    </w:lvl>
+    <w:lvl w:ilvl="6" w:tplc="040C0001" w:tentative="1">
+      <w:start w:val="1"/>
+      <w:numFmt w:val="bullet"/>
+      <w:lvlText w:val=""/>
+      <w:lvlJc w:val="left"/>
+      <w:pPr>
+        <w:ind w:left="5040" w:hanging="360"/>
+      </w:pPr>
+      <w:rPr>
+        <w:rFonts w:ascii="Symbol" w:hAnsi="Symbol" w:hint="default"/>
+      </w:rPr>
+    </w:lvl>
+    <w:lvl w:ilvl="7" w:tplc="040C0003" w:tentative="1">
+      <w:start w:val="1"/>
+      <w:numFmt w:val="bullet"/>
+      <w:lvlText w:val="o"/>
+      <w:lvlJc w:val="left"/>
+      <w:pPr>
+        <w:ind w:left="5760" w:hanging="360"/>
+      </w:pPr>
+      <w:rPr>
+        <w:rFonts w:ascii="Courier New" w:hAnsi="Courier New" w:cs="Courier New" w:hint="default"/>
+      </w:rPr>
+    </w:lvl>
+    <w:lvl w:ilvl="8" w:tplc="040C0005" w:tentative="1">
+      <w:start w:val="1"/>
+      <w:numFmt w:val="bullet"/>
+      <w:lvlText w:val=""/>
+      <w:lvlJc w:val="left"/>
+      <w:pPr>
+        <w:ind w:left="6480" w:hanging="360"/>
+      </w:pPr>
+      <w:rPr>
+        <w:rFonts w:ascii="Wingdings" w:hAnsi="Wingdings" w:hint="default"/>
+      </w:rPr>
+    </w:lvl>
+  </w:abstractNum>
+  <w:abstractNum w:abstractNumId="12" w15:restartNumberingAfterBreak="0">
+    <w:nsid w:val="2ADC788D"/>
+    <w:multiLevelType w:val="hybridMultilevel"/>
+    <w:tmpl w:val="14C88128"/>
+    <w:lvl w:ilvl="0" w:tplc="040C0001">
+      <w:start w:val="1"/>
+      <w:numFmt w:val="bullet"/>
+      <w:lvlText w:val=""/>
+      <w:lvlJc w:val="left"/>
+      <w:pPr>
+        <w:ind w:left="720" w:hanging="360"/>
+      </w:pPr>
+      <w:rPr>
+        <w:rFonts w:ascii="Symbol" w:hAnsi="Symbol" w:hint="default"/>
+      </w:rPr>
+    </w:lvl>
+    <w:lvl w:ilvl="1" w:tplc="040C0003" w:tentative="1">
+      <w:start w:val="1"/>
+      <w:numFmt w:val="bullet"/>
+      <w:lvlText w:val="o"/>
+      <w:lvlJc w:val="left"/>
+      <w:pPr>
+        <w:ind w:left="1440" w:hanging="360"/>
+      </w:pPr>
+      <w:rPr>
+        <w:rFonts w:ascii="Courier New" w:hAnsi="Courier New" w:cs="Courier New" w:hint="default"/>
+      </w:rPr>
+    </w:lvl>
+    <w:lvl w:ilvl="2" w:tplc="040C0005" w:tentative="1">
+      <w:start w:val="1"/>
+      <w:numFmt w:val="bullet"/>
+      <w:lvlText w:val=""/>
+      <w:lvlJc w:val="left"/>
+      <w:pPr>
+        <w:ind w:left="2160" w:hanging="360"/>
+      </w:pPr>
+      <w:rPr>
+        <w:rFonts w:ascii="Wingdings" w:hAnsi="Wingdings" w:hint="default"/>
+      </w:rPr>
+    </w:lvl>
+    <w:lvl w:ilvl="3" w:tplc="040C0001" w:tentative="1">
+      <w:start w:val="1"/>
+      <w:numFmt w:val="bullet"/>
+      <w:lvlText w:val=""/>
+      <w:lvlJc w:val="left"/>
+      <w:pPr>
+        <w:ind w:left="2880" w:hanging="360"/>
+      </w:pPr>
+      <w:rPr>
+        <w:rFonts w:ascii="Symbol" w:hAnsi="Symbol" w:hint="default"/>
+      </w:rPr>
+    </w:lvl>
+    <w:lvl w:ilvl="4" w:tplc="040C0003" w:tentative="1">
+      <w:start w:val="1"/>
+      <w:numFmt w:val="bullet"/>
+      <w:lvlText w:val="o"/>
+      <w:lvlJc w:val="left"/>
+      <w:pPr>
+        <w:ind w:left="3600" w:hanging="360"/>
+      </w:pPr>
+      <w:rPr>
+        <w:rFonts w:ascii="Courier New" w:hAnsi="Courier New" w:cs="Courier New" w:hint="default"/>
+      </w:rPr>
+    </w:lvl>
+    <w:lvl w:ilvl="5" w:tplc="040C0005" w:tentative="1">
+      <w:start w:val="1"/>
+      <w:numFmt w:val="bullet"/>
+      <w:lvlText w:val=""/>
+      <w:lvlJc w:val="left"/>
+      <w:pPr>
+        <w:ind w:left="4320" w:hanging="360"/>
+      </w:pPr>
+      <w:rPr>
+        <w:rFonts w:ascii="Wingdings" w:hAnsi="Wingdings" w:hint="default"/>
+      </w:rPr>
+    </w:lvl>
+    <w:lvl w:ilvl="6" w:tplc="040C0001" w:tentative="1">
+      <w:start w:val="1"/>
+      <w:numFmt w:val="bullet"/>
+      <w:lvlText w:val=""/>
+      <w:lvlJc w:val="left"/>
+      <w:pPr>
+        <w:ind w:left="5040" w:hanging="360"/>
+      </w:pPr>
+      <w:rPr>
+        <w:rFonts w:ascii="Symbol" w:hAnsi="Symbol" w:hint="default"/>
+      </w:rPr>
+    </w:lvl>
+    <w:lvl w:ilvl="7" w:tplc="040C0003" w:tentative="1">
+      <w:start w:val="1"/>
+      <w:numFmt w:val="bullet"/>
+      <w:lvlText w:val="o"/>
+      <w:lvlJc w:val="left"/>
+      <w:pPr>
+        <w:ind w:left="5760" w:hanging="360"/>
+      </w:pPr>
+      <w:rPr>
+        <w:rFonts w:ascii="Courier New" w:hAnsi="Courier New" w:cs="Courier New" w:hint="default"/>
+      </w:rPr>
+    </w:lvl>
+    <w:lvl w:ilvl="8" w:tplc="040C0005" w:tentative="1">
+      <w:start w:val="1"/>
+      <w:numFmt w:val="bullet"/>
+      <w:lvlText w:val=""/>
+      <w:lvlJc w:val="left"/>
+      <w:pPr>
+        <w:ind w:left="6480" w:hanging="360"/>
+      </w:pPr>
+      <w:rPr>
+        <w:rFonts w:ascii="Wingdings" w:hAnsi="Wingdings" w:hint="default"/>
+      </w:rPr>
+    </w:lvl>
+  </w:abstractNum>
+  <w:abstractNum w:abstractNumId="13" w15:restartNumberingAfterBreak="0">
+    <w:nsid w:val="423A77D0"/>
+    <w:multiLevelType w:val="hybridMultilevel"/>
+    <w:tmpl w:val="5EA2F320"/>
+    <w:lvl w:ilvl="0" w:tplc="040C0001">
+      <w:start w:val="1"/>
+      <w:numFmt w:val="bullet"/>
+      <w:lvlText w:val=""/>
+      <w:lvlJc w:val="left"/>
+      <w:pPr>
+        <w:ind w:left="720" w:hanging="360"/>
+      </w:pPr>
+      <w:rPr>
+        <w:rFonts w:ascii="Symbol" w:hAnsi="Symbol" w:hint="default"/>
+      </w:rPr>
+    </w:lvl>
+    <w:lvl w:ilvl="1" w:tplc="040C0003" w:tentative="1">
+      <w:start w:val="1"/>
+      <w:numFmt w:val="bullet"/>
+      <w:lvlText w:val="o"/>
+      <w:lvlJc w:val="left"/>
+      <w:pPr>
+        <w:ind w:left="1440" w:hanging="360"/>
+      </w:pPr>
+      <w:rPr>
+        <w:rFonts w:ascii="Courier New" w:hAnsi="Courier New" w:cs="Courier New" w:hint="default"/>
+      </w:rPr>
+    </w:lvl>
+    <w:lvl w:ilvl="2" w:tplc="040C0005" w:tentative="1">
+      <w:start w:val="1"/>
+      <w:numFmt w:val="bullet"/>
+      <w:lvlText w:val=""/>
+      <w:lvlJc w:val="left"/>
+      <w:pPr>
+        <w:ind w:left="2160" w:hanging="360"/>
+      </w:pPr>
+      <w:rPr>
+        <w:rFonts w:ascii="Wingdings" w:hAnsi="Wingdings" w:hint="default"/>
+      </w:rPr>
+    </w:lvl>
+    <w:lvl w:ilvl="3" w:tplc="040C0001" w:tentative="1">
+      <w:start w:val="1"/>
+      <w:numFmt w:val="bullet"/>
+      <w:lvlText w:val=""/>
+      <w:lvlJc w:val="left"/>
+      <w:pPr>
+        <w:ind w:left="2880" w:hanging="360"/>
+      </w:pPr>
+      <w:rPr>
+        <w:rFonts w:ascii="Symbol" w:hAnsi="Symbol" w:hint="default"/>
+      </w:rPr>
+    </w:lvl>
+    <w:lvl w:ilvl="4" w:tplc="040C0003" w:tentative="1">
+      <w:start w:val="1"/>
+      <w:numFmt w:val="bullet"/>
+      <w:lvlText w:val="o"/>
+      <w:lvlJc w:val="left"/>
+      <w:pPr>
+        <w:ind w:left="3600" w:hanging="360"/>
+      </w:pPr>
+      <w:rPr>
+        <w:rFonts w:ascii="Courier New" w:hAnsi="Courier New" w:cs="Courier New" w:hint="default"/>
+      </w:rPr>
+    </w:lvl>
+    <w:lvl w:ilvl="5" w:tplc="040C0005" w:tentative="1">
+      <w:start w:val="1"/>
+      <w:numFmt w:val="bullet"/>
+      <w:lvlText w:val=""/>
+      <w:lvlJc w:val="left"/>
+      <w:pPr>
+        <w:ind w:left="4320" w:hanging="360"/>
+      </w:pPr>
+      <w:rPr>
+        <w:rFonts w:ascii="Wingdings" w:hAnsi="Wingdings" w:hint="default"/>
+      </w:rPr>
+    </w:lvl>
+    <w:lvl w:ilvl="6" w:tplc="040C0001" w:tentative="1">
+      <w:start w:val="1"/>
+      <w:numFmt w:val="bullet"/>
+      <w:lvlText w:val=""/>
+      <w:lvlJc w:val="left"/>
+      <w:pPr>
+        <w:ind w:left="5040" w:hanging="360"/>
+      </w:pPr>
+      <w:rPr>
+        <w:rFonts w:ascii="Symbol" w:hAnsi="Symbol" w:hint="default"/>
+      </w:rPr>
+    </w:lvl>
+    <w:lvl w:ilvl="7" w:tplc="040C0003" w:tentative="1">
+      <w:start w:val="1"/>
+      <w:numFmt w:val="bullet"/>
+      <w:lvlText w:val="o"/>
+      <w:lvlJc w:val="left"/>
+      <w:pPr>
+        <w:ind w:left="5760" w:hanging="360"/>
+      </w:pPr>
+      <w:rPr>
+        <w:rFonts w:ascii="Courier New" w:hAnsi="Courier New" w:cs="Courier New" w:hint="default"/>
+      </w:rPr>
+    </w:lvl>
+    <w:lvl w:ilvl="8" w:tplc="040C0005" w:tentative="1">
+      <w:start w:val="1"/>
+      <w:numFmt w:val="bullet"/>
+      <w:lvlText w:val=""/>
+      <w:lvlJc w:val="left"/>
+      <w:pPr>
+        <w:ind w:left="6480" w:hanging="360"/>
+      </w:pPr>
+      <w:rPr>
+        <w:rFonts w:ascii="Wingdings" w:hAnsi="Wingdings" w:hint="default"/>
+      </w:rPr>
+    </w:lvl>
+  </w:abstractNum>
   <w:num w:numId="1" w16cid:durableId="1631282971">
     <w:abstractNumId w:val="8"/>
   </w:num>
@@ -32652,6 +31701,15 @@
   </w:num>
   <w:num w:numId="11" w16cid:durableId="210116250">
     <w:abstractNumId w:val="9"/>
+  </w:num>
+  <w:num w:numId="12" w16cid:durableId="1339773547">
+    <w:abstractNumId w:val="11"/>
+  </w:num>
+  <w:num w:numId="13" w16cid:durableId="703091451">
+    <w:abstractNumId w:val="12"/>
+  </w:num>
+  <w:num w:numId="14" w16cid:durableId="1624461795">
+    <w:abstractNumId w:val="13"/>
   </w:num>
 </w:numbering>
 </file>

</xml_diff>